<commit_message>
Borrador: solo portada + Capitulo I + Capitulo II, sin contraportada ni preliminares
</commit_message>
<xml_diff>
--- a/juliano/reportes/Informe_Pasantia_IUTECP_BORRADOR.docx
+++ b/juliano/reportes/Informe_Pasantia_IUTECP_BORRADOR.docx
@@ -115,1852 +115,6 @@
     </w:p>
     <w:p>
       <w:pPr>
-        <w:spacing w:line="276" w:lineRule="auto" w:before="0" w:after="0"/>
-        <w:jc w:val="center"/>
-      </w:pPr>
-      <w:r>
-        <w:rPr>
-          <w:rFonts w:ascii="Times New Roman" w:hAnsi="Times New Roman"/>
-          <w:b/>
-          <w:sz w:val="24"/>
-        </w:rPr>
-        <w:t>REPÚBLICA BOLIVARIANA DE VENEZUELA</w:t>
-        <w:br/>
-      </w:r>
-      <w:r>
-        <w:rPr>
-          <w:rFonts w:ascii="Times New Roman" w:hAnsi="Times New Roman"/>
-          <w:b/>
-          <w:sz w:val="24"/>
-        </w:rPr>
-        <w:t>MINISTERIO DEL PODER POPULAR PARA LA EDUCACIÓN UNIVERSITARIA</w:t>
-        <w:br/>
-      </w:r>
-      <w:r>
-        <w:rPr>
-          <w:rFonts w:ascii="Times New Roman" w:hAnsi="Times New Roman"/>
-          <w:b/>
-          <w:sz w:val="24"/>
-        </w:rPr>
-        <w:t>INSTITUTO UNIVERSITARIO DE TECNOLOGÍA</w:t>
-        <w:br/>
-      </w:r>
-      <w:r>
-        <w:rPr>
-          <w:rFonts w:ascii="Times New Roman" w:hAnsi="Times New Roman"/>
-          <w:b/>
-          <w:sz w:val="24"/>
-        </w:rPr>
-        <w:t>"ELÍAS CALIXTO POMPA" (IUTECP)</w:t>
-        <w:br/>
-      </w:r>
-      <w:r>
-        <w:rPr>
-          <w:rFonts w:ascii="Times New Roman" w:hAnsi="Times New Roman"/>
-          <w:b/>
-          <w:sz w:val="24"/>
-        </w:rPr>
-        <w:t>EL TIGRE, ESTADO ANZOÁTEGUI</w:t>
-      </w:r>
-    </w:p>
-    <w:p>
-      <w:pPr>
-        <w:spacing w:line="276" w:lineRule="auto" w:before="3844" w:after="0"/>
-        <w:jc w:val="center"/>
-      </w:pPr>
-      <w:r>
-        <w:rPr>
-          <w:rFonts w:ascii="Times New Roman" w:hAnsi="Times New Roman"/>
-          <w:b/>
-          <w:sz w:val="24"/>
-        </w:rPr>
-        <w:t>DISEÑO DE UN SISTEMA PARA EL CONTROL, TRAZABILIDAD Y REPORTE DE MOVIMIENTOS DOCUMENTALES EN LA PRESIDENCIA DE LA EMPRESA MIXTA PETROLERA VENANGOCUPET, S.A.</w:t>
-      </w:r>
-    </w:p>
-    <w:p>
-      <w:pPr>
-        <w:spacing w:line="276" w:lineRule="auto" w:before="2281" w:after="0"/>
-        <w:jc w:val="right"/>
-      </w:pPr>
-      <w:r>
-        <w:rPr>
-          <w:rFonts w:ascii="Times New Roman" w:hAnsi="Times New Roman"/>
-          <w:b/>
-          <w:sz w:val="24"/>
-        </w:rPr>
-        <w:t>Autor: Juliano Cardona</w:t>
-        <w:br/>
-      </w:r>
-      <w:r>
-        <w:rPr>
-          <w:rFonts w:ascii="Times New Roman" w:hAnsi="Times New Roman"/>
-          <w:b/>
-          <w:sz w:val="24"/>
-        </w:rPr>
-        <w:t>C.I.: 32.281.199</w:t>
-        <w:br/>
-      </w:r>
-      <w:r>
-        <w:rPr>
-          <w:rFonts w:ascii="Times New Roman" w:hAnsi="Times New Roman"/>
-          <w:b/>
-          <w:sz w:val="24"/>
-        </w:rPr>
-        <w:br/>
-      </w:r>
-      <w:r>
-        <w:rPr>
-          <w:rFonts w:ascii="Times New Roman" w:hAnsi="Times New Roman"/>
-          <w:b/>
-          <w:sz w:val="24"/>
-        </w:rPr>
-        <w:t>Tutor Industrial: Ing. Yasmin Sabaneta</w:t>
-        <w:br/>
-      </w:r>
-      <w:r>
-        <w:rPr>
-          <w:rFonts w:ascii="Times New Roman" w:hAnsi="Times New Roman"/>
-          <w:b/>
-          <w:sz w:val="24"/>
-        </w:rPr>
-        <w:t>C.I.: 14.187.924</w:t>
-        <w:br/>
-      </w:r>
-      <w:r>
-        <w:rPr>
-          <w:rFonts w:ascii="Times New Roman" w:hAnsi="Times New Roman"/>
-          <w:b/>
-          <w:sz w:val="24"/>
-        </w:rPr>
-        <w:br/>
-      </w:r>
-      <w:r>
-        <w:rPr>
-          <w:rFonts w:ascii="Times New Roman" w:hAnsi="Times New Roman"/>
-          <w:b/>
-          <w:sz w:val="24"/>
-        </w:rPr>
-        <w:t>Tutor Académico: Lic. Carlos Mendoza</w:t>
-      </w:r>
-    </w:p>
-    <w:p>
-      <w:pPr>
-        <w:spacing w:line="276" w:lineRule="auto" w:before="929" w:after="0"/>
-        <w:jc w:val="center"/>
-      </w:pPr>
-      <w:r>
-        <w:rPr>
-          <w:rFonts w:ascii="Times New Roman" w:hAnsi="Times New Roman"/>
-          <w:sz w:val="24"/>
-        </w:rPr>
-        <w:t>El Tigre, julio de 2026</w:t>
-      </w:r>
-    </w:p>
-    <w:p>
-      <w:pPr>
-        <w:sectPr>
-          <w:footerReference w:type="default" r:id="rId12"/>
-          <w:pgSz w:w="12240" w:h="15840"/>
-          <w:pgMar w:top="1701" w:right="1701" w:bottom="1701" w:left="2268" w:header="720" w:footer="720" w:gutter="0"/>
-          <w:cols w:space="720"/>
-          <w:titlePg/>
-          <w:docGrid w:linePitch="360"/>
-        </w:sectPr>
-      </w:pPr>
-    </w:p>
-    <w:p>
-      <w:bookmarkStart w:id="bm_dedicatoria" w:name="bm_dedicatoria"/>
-      <w:pPr>
-        <w:spacing w:after="480"/>
-        <w:jc w:val="center"/>
-      </w:pPr>
-      <w:r>
-        <w:rPr>
-          <w:rFonts w:ascii="Times New Roman" w:hAnsi="Times New Roman"/>
-          <w:b/>
-          <w:sz w:val="24"/>
-        </w:rPr>
-        <w:t>DEDICATORIA</w:t>
-      </w:r>
-      <w:bookmarkEnd w:id="bm_dedicatoria"/>
-    </w:p>
-    <w:p>
-      <w:pPr>
-        <w:sectPr>
-          <w:footerReference w:type="default" r:id="rId13"/>
-          <w:pgSz w:w="12240" w:h="15840"/>
-          <w:pgMar w:top="2835" w:right="1701" w:bottom="1701" w:left="2268" w:header="720" w:footer="720" w:gutter="0"/>
-          <w:cols w:space="720"/>
-          <w:titlePg/>
-          <w:docGrid w:linePitch="360"/>
-        </w:sectPr>
-      </w:pPr>
-    </w:p>
-    <w:p>
-      <w:pPr>
-        <w:spacing w:line="360" w:lineRule="auto" w:after="0" w:before="0"/>
-        <w:ind w:firstLine="709"/>
-        <w:jc w:val="both"/>
-      </w:pPr>
-      <w:r>
-        <w:rPr>
-          <w:rFonts w:ascii="Times New Roman" w:hAnsi="Times New Roman"/>
-          <w:i w:val="0"/>
-          <w:sz w:val="24"/>
-        </w:rPr>
-        <w:t>A mi familia, por su apoyo incondicional en cada paso de mi formación académica y personal.</w:t>
-      </w:r>
-    </w:p>
-    <w:p>
-      <w:pPr>
-        <w:sectPr>
-          <w:footerReference w:type="default" r:id="rId14"/>
-          <w:type w:val="continuous"/>
-          <w:pgSz w:w="12240" w:h="15840"/>
-          <w:pgMar w:top="1701" w:right="1701" w:bottom="1701" w:left="2268" w:header="720" w:footer="720" w:gutter="0"/>
-          <w:cols w:space="720"/>
-          <w:titlePg/>
-          <w:docGrid w:linePitch="360"/>
-        </w:sectPr>
-      </w:pPr>
-    </w:p>
-    <w:p>
-      <w:bookmarkStart w:id="bm_agradecimientos" w:name="bm_agradecimientos"/>
-      <w:pPr>
-        <w:spacing w:after="480"/>
-        <w:jc w:val="center"/>
-      </w:pPr>
-      <w:r>
-        <w:rPr>
-          <w:rFonts w:ascii="Times New Roman" w:hAnsi="Times New Roman"/>
-          <w:b/>
-          <w:sz w:val="24"/>
-        </w:rPr>
-        <w:t>AGRADECIMIENTOS</w:t>
-      </w:r>
-      <w:bookmarkEnd w:id="bm_agradecimientos"/>
-    </w:p>
-    <w:p>
-      <w:pPr>
-        <w:sectPr>
-          <w:footerReference w:type="default" r:id="rId15"/>
-          <w:pgSz w:w="12240" w:h="15840"/>
-          <w:pgMar w:top="2835" w:right="1701" w:bottom="1701" w:left="2268" w:header="720" w:footer="720" w:gutter="0"/>
-          <w:cols w:space="720"/>
-          <w:titlePg/>
-          <w:docGrid w:linePitch="360"/>
-        </w:sectPr>
-      </w:pPr>
-    </w:p>
-    <w:p>
-      <w:pPr>
-        <w:spacing w:line="360" w:lineRule="auto" w:after="0" w:before="0"/>
-        <w:ind w:firstLine="709"/>
-        <w:jc w:val="both"/>
-      </w:pPr>
-      <w:r>
-        <w:rPr>
-          <w:rFonts w:ascii="Times New Roman" w:hAnsi="Times New Roman"/>
-          <w:i w:val="0"/>
-          <w:sz w:val="24"/>
-        </w:rPr>
-        <w:t>A la Empresa Mixta Petrolera Venangocupet, S.A., por abrir las puertas de su organización y brindar la oportunidad de desarrollar este proyecto técnico de la mano de excelentes profesionales.</w:t>
-      </w:r>
-    </w:p>
-    <w:p>
-      <w:pPr>
-        <w:sectPr>
-          <w:footerReference w:type="default" r:id="rId16"/>
-          <w:type w:val="continuous"/>
-          <w:pgSz w:w="12240" w:h="15840"/>
-          <w:pgMar w:top="1701" w:right="1701" w:bottom="1701" w:left="2268" w:header="720" w:footer="720" w:gutter="0"/>
-          <w:cols w:space="720"/>
-          <w:titlePg/>
-          <w:docGrid w:linePitch="360"/>
-        </w:sectPr>
-      </w:pPr>
-    </w:p>
-    <w:p>
-      <w:bookmarkStart w:id="bm_resumen" w:name="bm_resumen"/>
-      <w:pPr>
-        <w:spacing w:after="480"/>
-        <w:jc w:val="center"/>
-      </w:pPr>
-      <w:r>
-        <w:rPr>
-          <w:rFonts w:ascii="Times New Roman" w:hAnsi="Times New Roman"/>
-          <w:b/>
-          <w:sz w:val="24"/>
-        </w:rPr>
-        <w:t>RESUMEN</w:t>
-      </w:r>
-      <w:bookmarkEnd w:id="bm_resumen"/>
-    </w:p>
-    <w:p>
-      <w:pPr>
-        <w:sectPr>
-          <w:footerReference w:type="default" r:id="rId17"/>
-          <w:pgSz w:w="12240" w:h="15840"/>
-          <w:pgMar w:top="2835" w:right="1701" w:bottom="1701" w:left="2268" w:header="720" w:footer="720" w:gutter="0"/>
-          <w:cols w:space="720"/>
-          <w:titlePg/>
-          <w:docGrid w:linePitch="360"/>
-        </w:sectPr>
-      </w:pPr>
-    </w:p>
-    <w:p>
-      <w:pPr>
-        <w:spacing w:line="360" w:lineRule="auto" w:after="0" w:before="0"/>
-        <w:ind w:firstLine="709"/>
-        <w:jc w:val="both"/>
-      </w:pPr>
-      <w:r>
-        <w:rPr>
-          <w:rFonts w:ascii="Times New Roman" w:hAnsi="Times New Roman"/>
-          <w:i w:val="0"/>
-          <w:sz w:val="24"/>
-        </w:rPr>
-        <w:t>El presente informe describe el diseño de un sistema automatizado para el control, trazabilidad y reporte de movimientos documentales en la Presidencia de la Empresa Mixta Petrolera Venangocupet, S.A. La investigación se enmarca en la modalidad de proyecto factible apoyado en un diagnóstico de campo. Durante el estudio se identificaron demoras operativas derivadas de la transcripción manual en hojas de cálculo y deficiencias en la generación de reportes inmediatos ante altos volúmenes de concurrencia. La solución tecnológica abarca el modelado lógico de datos en SQLite y la construcción de una aplicación de escritorio mediante código HTML empaquetado con el framework Wails, optimizando el registro, búsqueda y auditoría del flujo documental para fortalecer la toma de decisiones gerenciales.</w:t>
-      </w:r>
-    </w:p>
-    <w:p/>
-    <w:p>
-      <w:pPr>
-        <w:ind w:firstLine="709"/>
-      </w:pPr>
-      <w:r>
-        <w:rPr>
-          <w:b/>
-        </w:rPr>
-        <w:t xml:space="preserve">Palabras claves: </w:t>
-      </w:r>
-      <w:r>
-        <w:t>sistema, trazabilidad, automatización, Wails, proyecto factible, pasantías.</w:t>
-      </w:r>
-    </w:p>
-    <w:p>
-      <w:pPr>
-        <w:sectPr>
-          <w:footerReference w:type="default" r:id="rId18"/>
-          <w:type w:val="continuous"/>
-          <w:pgSz w:w="12240" w:h="15840"/>
-          <w:pgMar w:top="1701" w:right="1701" w:bottom="1701" w:left="2268" w:header="720" w:footer="720" w:gutter="0"/>
-          <w:cols w:space="720"/>
-          <w:titlePg/>
-          <w:docGrid w:linePitch="360"/>
-        </w:sectPr>
-      </w:pPr>
-    </w:p>
-    <w:p>
-      <w:pPr>
-        <w:spacing w:after="480"/>
-        <w:jc w:val="center"/>
-      </w:pPr>
-      <w:r>
-        <w:rPr>
-          <w:rFonts w:ascii="Times New Roman" w:hAnsi="Times New Roman"/>
-          <w:b/>
-          <w:sz w:val="24"/>
-        </w:rPr>
-        <w:t>ÍNDICE DE CONTENIDO</w:t>
-      </w:r>
-    </w:p>
-    <w:p>
-      <w:pPr>
-        <w:sectPr>
-          <w:footerReference w:type="default" r:id="rId19"/>
-          <w:pgSz w:w="12240" w:h="15840"/>
-          <w:pgMar w:top="2835" w:right="1701" w:bottom="1701" w:left="2268" w:header="720" w:footer="720" w:gutter="0"/>
-          <w:cols w:space="720"/>
-          <w:titlePg/>
-          <w:docGrid w:linePitch="360"/>
-        </w:sectPr>
-      </w:pPr>
-    </w:p>
-    <w:p>
-      <w:pPr>
-        <w:spacing w:after="240"/>
-        <w:jc w:val="right"/>
-      </w:pPr>
-      <w:r>
-        <w:rPr>
-          <w:rFonts w:ascii="Times New Roman" w:hAnsi="Times New Roman"/>
-          <w:b/>
-          <w:sz w:val="24"/>
-        </w:rPr>
-        <w:t>pp.</w:t>
-      </w:r>
-    </w:p>
-    <w:p>
-      <w:pPr>
-        <w:tabs>
-          <w:tab w:pos="8271" w:val="right" w:leader="dot"/>
-        </w:tabs>
-        <w:spacing w:line="360" w:lineRule="auto" w:before="0" w:after="80"/>
-        <w:ind w:left="0"/>
-      </w:pPr>
-      <w:r>
-        <w:rPr>
-          <w:rFonts w:ascii="Times New Roman" w:hAnsi="Times New Roman"/>
-          <w:b w:val="0"/>
-          <w:sz w:val="24"/>
-        </w:rPr>
-        <w:t>DEDICATORIA</w:t>
-        <w:tab/>
-      </w:r>
-      <w:r>
-        <w:rPr>
-          <w:rFonts w:ascii="Times New Roman" w:hAnsi="Times New Roman"/>
-          <w:b w:val="0"/>
-          <w:sz w:val="24"/>
-        </w:rPr>
-        <w:fldChar w:fldCharType="begin"/>
-        <w:instrText xml:space="preserve"> PAGEREF bm_dedicatoria \h </w:instrText>
-        <w:fldChar w:fldCharType="separate"/>
-        <w:t>?</w:t>
-        <w:fldChar w:fldCharType="end"/>
-      </w:r>
-    </w:p>
-    <w:p>
-      <w:pPr>
-        <w:tabs>
-          <w:tab w:pos="8271" w:val="right" w:leader="dot"/>
-        </w:tabs>
-        <w:spacing w:line="360" w:lineRule="auto" w:before="0" w:after="80"/>
-        <w:ind w:left="0"/>
-      </w:pPr>
-      <w:r>
-        <w:rPr>
-          <w:rFonts w:ascii="Times New Roman" w:hAnsi="Times New Roman"/>
-          <w:b w:val="0"/>
-          <w:sz w:val="24"/>
-        </w:rPr>
-        <w:t>AGRADECIMIENTOS</w:t>
-        <w:tab/>
-      </w:r>
-      <w:r>
-        <w:rPr>
-          <w:rFonts w:ascii="Times New Roman" w:hAnsi="Times New Roman"/>
-          <w:b w:val="0"/>
-          <w:sz w:val="24"/>
-        </w:rPr>
-        <w:fldChar w:fldCharType="begin"/>
-        <w:instrText xml:space="preserve"> PAGEREF bm_agradecimientos \h </w:instrText>
-        <w:fldChar w:fldCharType="separate"/>
-        <w:t>?</w:t>
-        <w:fldChar w:fldCharType="end"/>
-      </w:r>
-    </w:p>
-    <w:p>
-      <w:pPr>
-        <w:tabs>
-          <w:tab w:pos="8271" w:val="right" w:leader="dot"/>
-        </w:tabs>
-        <w:spacing w:line="360" w:lineRule="auto" w:before="0" w:after="80"/>
-        <w:ind w:left="0"/>
-      </w:pPr>
-      <w:r>
-        <w:rPr>
-          <w:rFonts w:ascii="Times New Roman" w:hAnsi="Times New Roman"/>
-          <w:b w:val="0"/>
-          <w:sz w:val="24"/>
-        </w:rPr>
-        <w:t>RESUMEN</w:t>
-        <w:tab/>
-      </w:r>
-      <w:r>
-        <w:rPr>
-          <w:rFonts w:ascii="Times New Roman" w:hAnsi="Times New Roman"/>
-          <w:b w:val="0"/>
-          <w:sz w:val="24"/>
-        </w:rPr>
-        <w:fldChar w:fldCharType="begin"/>
-        <w:instrText xml:space="preserve"> PAGEREF bm_resumen \h </w:instrText>
-        <w:fldChar w:fldCharType="separate"/>
-        <w:t>?</w:t>
-        <w:fldChar w:fldCharType="end"/>
-      </w:r>
-    </w:p>
-    <w:p>
-      <w:pPr>
-        <w:tabs>
-          <w:tab w:pos="8271" w:val="right" w:leader="dot"/>
-        </w:tabs>
-        <w:spacing w:line="360" w:lineRule="auto" w:before="0" w:after="80"/>
-        <w:ind w:left="0"/>
-      </w:pPr>
-      <w:r>
-        <w:rPr>
-          <w:rFonts w:ascii="Times New Roman" w:hAnsi="Times New Roman"/>
-          <w:b w:val="0"/>
-          <w:sz w:val="24"/>
-        </w:rPr>
-        <w:t>LISTA DE CUADROS</w:t>
-        <w:tab/>
-      </w:r>
-      <w:r>
-        <w:rPr>
-          <w:rFonts w:ascii="Times New Roman" w:hAnsi="Times New Roman"/>
-          <w:b w:val="0"/>
-          <w:sz w:val="24"/>
-        </w:rPr>
-        <w:fldChar w:fldCharType="begin"/>
-        <w:instrText xml:space="preserve"> PAGEREF bm_lista_cuadros \h </w:instrText>
-        <w:fldChar w:fldCharType="separate"/>
-        <w:t>?</w:t>
-        <w:fldChar w:fldCharType="end"/>
-      </w:r>
-    </w:p>
-    <w:p>
-      <w:pPr>
-        <w:tabs>
-          <w:tab w:pos="8271" w:val="right" w:leader="dot"/>
-        </w:tabs>
-        <w:spacing w:line="360" w:lineRule="auto" w:before="0" w:after="80"/>
-        <w:ind w:left="0"/>
-      </w:pPr>
-      <w:r>
-        <w:rPr>
-          <w:rFonts w:ascii="Times New Roman" w:hAnsi="Times New Roman"/>
-          <w:b w:val="0"/>
-          <w:sz w:val="24"/>
-        </w:rPr>
-        <w:t>LISTA DE GRÁFICOS</w:t>
-        <w:tab/>
-      </w:r>
-      <w:r>
-        <w:rPr>
-          <w:rFonts w:ascii="Times New Roman" w:hAnsi="Times New Roman"/>
-          <w:b w:val="0"/>
-          <w:sz w:val="24"/>
-        </w:rPr>
-        <w:fldChar w:fldCharType="begin"/>
-        <w:instrText xml:space="preserve"> PAGEREF bm_lista_graficos \h </w:instrText>
-        <w:fldChar w:fldCharType="separate"/>
-        <w:t>?</w:t>
-        <w:fldChar w:fldCharType="end"/>
-      </w:r>
-    </w:p>
-    <w:p>
-      <w:pPr>
-        <w:tabs>
-          <w:tab w:pos="8271" w:val="right" w:leader="dot"/>
-        </w:tabs>
-        <w:spacing w:line="360" w:lineRule="auto" w:before="0" w:after="80"/>
-        <w:ind w:left="0"/>
-      </w:pPr>
-      <w:r>
-        <w:rPr>
-          <w:rFonts w:ascii="Times New Roman" w:hAnsi="Times New Roman"/>
-          <w:b w:val="0"/>
-          <w:sz w:val="24"/>
-        </w:rPr>
-        <w:t>LISTA DE ANEXOS</w:t>
-        <w:tab/>
-      </w:r>
-      <w:r>
-        <w:rPr>
-          <w:rFonts w:ascii="Times New Roman" w:hAnsi="Times New Roman"/>
-          <w:b w:val="0"/>
-          <w:sz w:val="24"/>
-        </w:rPr>
-        <w:fldChar w:fldCharType="begin"/>
-        <w:instrText xml:space="preserve"> PAGEREF bm_lista_anexos \h </w:instrText>
-        <w:fldChar w:fldCharType="separate"/>
-        <w:t>?</w:t>
-        <w:fldChar w:fldCharType="end"/>
-      </w:r>
-    </w:p>
-    <w:p>
-      <w:pPr>
-        <w:tabs>
-          <w:tab w:pos="8271" w:val="right" w:leader="dot"/>
-        </w:tabs>
-        <w:spacing w:line="360" w:lineRule="auto" w:before="0" w:after="80"/>
-        <w:ind w:left="0"/>
-      </w:pPr>
-      <w:r>
-        <w:rPr>
-          <w:rFonts w:ascii="Times New Roman" w:hAnsi="Times New Roman"/>
-          <w:b w:val="0"/>
-          <w:sz w:val="24"/>
-        </w:rPr>
-        <w:t>INTRODUCCIÓN</w:t>
-        <w:tab/>
-      </w:r>
-      <w:r>
-        <w:rPr>
-          <w:rFonts w:ascii="Times New Roman" w:hAnsi="Times New Roman"/>
-          <w:b w:val="0"/>
-          <w:sz w:val="24"/>
-        </w:rPr>
-        <w:fldChar w:fldCharType="begin"/>
-        <w:instrText xml:space="preserve"> PAGEREF bm_introduccion \h </w:instrText>
-        <w:fldChar w:fldCharType="separate"/>
-        <w:t>?</w:t>
-        <w:fldChar w:fldCharType="end"/>
-      </w:r>
-    </w:p>
-    <w:p>
-      <w:pPr>
-        <w:spacing w:before="240" w:after="120"/>
-      </w:pPr>
-      <w:r>
-        <w:rPr>
-          <w:b/>
-        </w:rPr>
-        <w:t>CAPÍTULOS</w:t>
-      </w:r>
-    </w:p>
-    <w:p>
-      <w:pPr>
-        <w:tabs>
-          <w:tab w:pos="8271" w:val="right" w:leader="dot"/>
-        </w:tabs>
-        <w:spacing w:line="360" w:lineRule="auto" w:before="0" w:after="80"/>
-        <w:ind w:left="0"/>
-      </w:pPr>
-      <w:r>
-        <w:rPr>
-          <w:rFonts w:ascii="Times New Roman" w:hAnsi="Times New Roman"/>
-          <w:b/>
-          <w:sz w:val="24"/>
-        </w:rPr>
-        <w:t>I REALIDAD ORGANIZACIONAL</w:t>
-        <w:tab/>
-      </w:r>
-      <w:r>
-        <w:rPr>
-          <w:rFonts w:ascii="Times New Roman" w:hAnsi="Times New Roman"/>
-          <w:b/>
-          <w:sz w:val="24"/>
-        </w:rPr>
-        <w:fldChar w:fldCharType="begin"/>
-        <w:instrText xml:space="preserve"> PAGEREF bm_cap1 \h </w:instrText>
-        <w:fldChar w:fldCharType="separate"/>
-        <w:t>?</w:t>
-        <w:fldChar w:fldCharType="end"/>
-      </w:r>
-    </w:p>
-    <w:p>
-      <w:pPr>
-        <w:tabs>
-          <w:tab w:pos="8271" w:val="right" w:leader="dot"/>
-        </w:tabs>
-        <w:spacing w:line="360" w:lineRule="auto" w:before="0" w:after="80"/>
-        <w:ind w:left="283"/>
-      </w:pPr>
-      <w:r>
-        <w:rPr>
-          <w:rFonts w:ascii="Times New Roman" w:hAnsi="Times New Roman"/>
-          <w:b w:val="0"/>
-          <w:sz w:val="24"/>
-        </w:rPr>
-        <w:t>Identificación de la empresa</w:t>
-        <w:tab/>
-      </w:r>
-      <w:r>
-        <w:rPr>
-          <w:rFonts w:ascii="Times New Roman" w:hAnsi="Times New Roman"/>
-          <w:b w:val="0"/>
-          <w:sz w:val="24"/>
-        </w:rPr>
-        <w:fldChar w:fldCharType="begin"/>
-        <w:instrText xml:space="preserve"> PAGEREF bm_cap1_ident \h </w:instrText>
-        <w:fldChar w:fldCharType="separate"/>
-        <w:t>?</w:t>
-        <w:fldChar w:fldCharType="end"/>
-      </w:r>
-    </w:p>
-    <w:p>
-      <w:pPr>
-        <w:tabs>
-          <w:tab w:pos="8271" w:val="right" w:leader="dot"/>
-        </w:tabs>
-        <w:spacing w:line="360" w:lineRule="auto" w:before="0" w:after="80"/>
-        <w:ind w:left="283"/>
-      </w:pPr>
-      <w:r>
-        <w:rPr>
-          <w:rFonts w:ascii="Times New Roman" w:hAnsi="Times New Roman"/>
-          <w:b w:val="0"/>
-          <w:sz w:val="24"/>
-        </w:rPr>
-        <w:t>Reseña histórica</w:t>
-        <w:tab/>
-      </w:r>
-      <w:r>
-        <w:rPr>
-          <w:rFonts w:ascii="Times New Roman" w:hAnsi="Times New Roman"/>
-          <w:b w:val="0"/>
-          <w:sz w:val="24"/>
-        </w:rPr>
-        <w:fldChar w:fldCharType="begin"/>
-        <w:instrText xml:space="preserve"> PAGEREF bm_cap1_resena \h </w:instrText>
-        <w:fldChar w:fldCharType="separate"/>
-        <w:t>?</w:t>
-        <w:fldChar w:fldCharType="end"/>
-      </w:r>
-    </w:p>
-    <w:p>
-      <w:pPr>
-        <w:tabs>
-          <w:tab w:pos="8271" w:val="right" w:leader="dot"/>
-        </w:tabs>
-        <w:spacing w:line="360" w:lineRule="auto" w:before="0" w:after="80"/>
-        <w:ind w:left="283"/>
-      </w:pPr>
-      <w:r>
-        <w:rPr>
-          <w:rFonts w:ascii="Times New Roman" w:hAnsi="Times New Roman"/>
-          <w:b w:val="0"/>
-          <w:sz w:val="24"/>
-        </w:rPr>
-        <w:t>Misión</w:t>
-        <w:tab/>
-      </w:r>
-      <w:r>
-        <w:rPr>
-          <w:rFonts w:ascii="Times New Roman" w:hAnsi="Times New Roman"/>
-          <w:b w:val="0"/>
-          <w:sz w:val="24"/>
-        </w:rPr>
-        <w:fldChar w:fldCharType="begin"/>
-        <w:instrText xml:space="preserve"> PAGEREF bm_cap1_mision \h </w:instrText>
-        <w:fldChar w:fldCharType="separate"/>
-        <w:t>?</w:t>
-        <w:fldChar w:fldCharType="end"/>
-      </w:r>
-    </w:p>
-    <w:p>
-      <w:pPr>
-        <w:tabs>
-          <w:tab w:pos="8271" w:val="right" w:leader="dot"/>
-        </w:tabs>
-        <w:spacing w:line="360" w:lineRule="auto" w:before="0" w:after="80"/>
-        <w:ind w:left="283"/>
-      </w:pPr>
-      <w:r>
-        <w:rPr>
-          <w:rFonts w:ascii="Times New Roman" w:hAnsi="Times New Roman"/>
-          <w:b w:val="0"/>
-          <w:sz w:val="24"/>
-        </w:rPr>
-        <w:t>Visión</w:t>
-        <w:tab/>
-      </w:r>
-      <w:r>
-        <w:rPr>
-          <w:rFonts w:ascii="Times New Roman" w:hAnsi="Times New Roman"/>
-          <w:b w:val="0"/>
-          <w:sz w:val="24"/>
-        </w:rPr>
-        <w:fldChar w:fldCharType="begin"/>
-        <w:instrText xml:space="preserve"> PAGEREF bm_cap1_vision \h </w:instrText>
-        <w:fldChar w:fldCharType="separate"/>
-        <w:t>?</w:t>
-        <w:fldChar w:fldCharType="end"/>
-      </w:r>
-    </w:p>
-    <w:p>
-      <w:pPr>
-        <w:tabs>
-          <w:tab w:pos="8271" w:val="right" w:leader="dot"/>
-        </w:tabs>
-        <w:spacing w:line="360" w:lineRule="auto" w:before="0" w:after="80"/>
-        <w:ind w:left="283"/>
-      </w:pPr>
-      <w:r>
-        <w:rPr>
-          <w:rFonts w:ascii="Times New Roman" w:hAnsi="Times New Roman"/>
-          <w:b w:val="0"/>
-          <w:sz w:val="24"/>
-        </w:rPr>
-        <w:t>Valores</w:t>
-        <w:tab/>
-      </w:r>
-      <w:r>
-        <w:rPr>
-          <w:rFonts w:ascii="Times New Roman" w:hAnsi="Times New Roman"/>
-          <w:b w:val="0"/>
-          <w:sz w:val="24"/>
-        </w:rPr>
-        <w:fldChar w:fldCharType="begin"/>
-        <w:instrText xml:space="preserve"> PAGEREF bm_cap1_valores \h </w:instrText>
-        <w:fldChar w:fldCharType="separate"/>
-        <w:t>?</w:t>
-        <w:fldChar w:fldCharType="end"/>
-      </w:r>
-    </w:p>
-    <w:p>
-      <w:pPr>
-        <w:tabs>
-          <w:tab w:pos="8271" w:val="right" w:leader="dot"/>
-        </w:tabs>
-        <w:spacing w:line="360" w:lineRule="auto" w:before="0" w:after="80"/>
-        <w:ind w:left="283"/>
-      </w:pPr>
-      <w:r>
-        <w:rPr>
-          <w:rFonts w:ascii="Times New Roman" w:hAnsi="Times New Roman"/>
-          <w:b w:val="0"/>
-          <w:sz w:val="24"/>
-        </w:rPr>
-        <w:t>Objetivos Organizacionales</w:t>
-        <w:tab/>
-      </w:r>
-      <w:r>
-        <w:rPr>
-          <w:rFonts w:ascii="Times New Roman" w:hAnsi="Times New Roman"/>
-          <w:b w:val="0"/>
-          <w:sz w:val="24"/>
-        </w:rPr>
-        <w:fldChar w:fldCharType="begin"/>
-        <w:instrText xml:space="preserve"> PAGEREF bm_cap1_obj \h </w:instrText>
-        <w:fldChar w:fldCharType="separate"/>
-        <w:t>?</w:t>
-        <w:fldChar w:fldCharType="end"/>
-      </w:r>
-    </w:p>
-    <w:p>
-      <w:pPr>
-        <w:tabs>
-          <w:tab w:pos="8271" w:val="right" w:leader="dot"/>
-        </w:tabs>
-        <w:spacing w:line="360" w:lineRule="auto" w:before="0" w:after="80"/>
-        <w:ind w:left="283"/>
-      </w:pPr>
-      <w:r>
-        <w:rPr>
-          <w:rFonts w:ascii="Times New Roman" w:hAnsi="Times New Roman"/>
-          <w:b w:val="0"/>
-          <w:sz w:val="24"/>
-        </w:rPr>
-        <w:t>Ubicación geográfica</w:t>
-        <w:tab/>
-      </w:r>
-      <w:r>
-        <w:rPr>
-          <w:rFonts w:ascii="Times New Roman" w:hAnsi="Times New Roman"/>
-          <w:b w:val="0"/>
-          <w:sz w:val="24"/>
-        </w:rPr>
-        <w:fldChar w:fldCharType="begin"/>
-        <w:instrText xml:space="preserve"> PAGEREF bm_cap1_ubic \h </w:instrText>
-        <w:fldChar w:fldCharType="separate"/>
-        <w:t>?</w:t>
-        <w:fldChar w:fldCharType="end"/>
-      </w:r>
-    </w:p>
-    <w:p>
-      <w:pPr>
-        <w:tabs>
-          <w:tab w:pos="8271" w:val="right" w:leader="dot"/>
-        </w:tabs>
-        <w:spacing w:line="360" w:lineRule="auto" w:before="0" w:after="80"/>
-        <w:ind w:left="283"/>
-      </w:pPr>
-      <w:r>
-        <w:rPr>
-          <w:rFonts w:ascii="Times New Roman" w:hAnsi="Times New Roman"/>
-          <w:b w:val="0"/>
-          <w:sz w:val="24"/>
-        </w:rPr>
-        <w:t>Población de los trabajadores de la empresa</w:t>
-        <w:tab/>
-      </w:r>
-      <w:r>
-        <w:rPr>
-          <w:rFonts w:ascii="Times New Roman" w:hAnsi="Times New Roman"/>
-          <w:b w:val="0"/>
-          <w:sz w:val="24"/>
-        </w:rPr>
-        <w:fldChar w:fldCharType="begin"/>
-        <w:instrText xml:space="preserve"> PAGEREF bm_cap1_pobla \h </w:instrText>
-        <w:fldChar w:fldCharType="separate"/>
-        <w:t>?</w:t>
-        <w:fldChar w:fldCharType="end"/>
-      </w:r>
-    </w:p>
-    <w:p>
-      <w:pPr>
-        <w:tabs>
-          <w:tab w:pos="8271" w:val="right" w:leader="dot"/>
-        </w:tabs>
-        <w:spacing w:line="360" w:lineRule="auto" w:before="0" w:after="80"/>
-        <w:ind w:left="283"/>
-      </w:pPr>
-      <w:r>
-        <w:rPr>
-          <w:rFonts w:ascii="Times New Roman" w:hAnsi="Times New Roman"/>
-          <w:b w:val="0"/>
-          <w:sz w:val="24"/>
-        </w:rPr>
-        <w:t>Estructura organizacional de la empresa (organigrama)</w:t>
-        <w:tab/>
-      </w:r>
-      <w:r>
-        <w:rPr>
-          <w:rFonts w:ascii="Times New Roman" w:hAnsi="Times New Roman"/>
-          <w:b w:val="0"/>
-          <w:sz w:val="24"/>
-        </w:rPr>
-        <w:fldChar w:fldCharType="begin"/>
-        <w:instrText xml:space="preserve"> PAGEREF bm_cap1_estruct \h </w:instrText>
-        <w:fldChar w:fldCharType="separate"/>
-        <w:t>?</w:t>
-        <w:fldChar w:fldCharType="end"/>
-      </w:r>
-    </w:p>
-    <w:p>
-      <w:pPr>
-        <w:tabs>
-          <w:tab w:pos="8271" w:val="right" w:leader="dot"/>
-        </w:tabs>
-        <w:spacing w:line="360" w:lineRule="auto" w:before="0" w:after="80"/>
-        <w:ind w:left="0"/>
-      </w:pPr>
-      <w:r>
-        <w:rPr>
-          <w:rFonts w:ascii="Times New Roman" w:hAnsi="Times New Roman"/>
-          <w:b/>
-          <w:sz w:val="24"/>
-        </w:rPr>
-        <w:t>II DIAGNÓSTICO SITUACIONAL</w:t>
-        <w:tab/>
-      </w:r>
-      <w:r>
-        <w:rPr>
-          <w:rFonts w:ascii="Times New Roman" w:hAnsi="Times New Roman"/>
-          <w:b/>
-          <w:sz w:val="24"/>
-        </w:rPr>
-        <w:fldChar w:fldCharType="begin"/>
-        <w:instrText xml:space="preserve"> PAGEREF bm_cap2 \h </w:instrText>
-        <w:fldChar w:fldCharType="separate"/>
-        <w:t>?</w:t>
-        <w:fldChar w:fldCharType="end"/>
-      </w:r>
-    </w:p>
-    <w:p>
-      <w:pPr>
-        <w:tabs>
-          <w:tab w:pos="8271" w:val="right" w:leader="dot"/>
-        </w:tabs>
-        <w:spacing w:line="360" w:lineRule="auto" w:before="0" w:after="80"/>
-        <w:ind w:left="283"/>
-      </w:pPr>
-      <w:r>
-        <w:rPr>
-          <w:rFonts w:ascii="Times New Roman" w:hAnsi="Times New Roman"/>
-          <w:b w:val="0"/>
-          <w:sz w:val="24"/>
-        </w:rPr>
-        <w:t>Identificación de la situación problemática</w:t>
-        <w:tab/>
-      </w:r>
-      <w:r>
-        <w:rPr>
-          <w:rFonts w:ascii="Times New Roman" w:hAnsi="Times New Roman"/>
-          <w:b w:val="0"/>
-          <w:sz w:val="24"/>
-        </w:rPr>
-        <w:fldChar w:fldCharType="begin"/>
-        <w:instrText xml:space="preserve"> PAGEREF bm_cap2_sit \h </w:instrText>
-        <w:fldChar w:fldCharType="separate"/>
-        <w:t>?</w:t>
-        <w:fldChar w:fldCharType="end"/>
-      </w:r>
-    </w:p>
-    <w:p>
-      <w:pPr>
-        <w:tabs>
-          <w:tab w:pos="8271" w:val="right" w:leader="dot"/>
-        </w:tabs>
-        <w:spacing w:line="360" w:lineRule="auto" w:before="0" w:after="80"/>
-        <w:ind w:left="283"/>
-      </w:pPr>
-      <w:r>
-        <w:rPr>
-          <w:rFonts w:ascii="Times New Roman" w:hAnsi="Times New Roman"/>
-          <w:b w:val="0"/>
-          <w:sz w:val="24"/>
-        </w:rPr>
-        <w:t>Objetivo General</w:t>
-        <w:tab/>
-      </w:r>
-      <w:r>
-        <w:rPr>
-          <w:rFonts w:ascii="Times New Roman" w:hAnsi="Times New Roman"/>
-          <w:b w:val="0"/>
-          <w:sz w:val="24"/>
-        </w:rPr>
-        <w:fldChar w:fldCharType="begin"/>
-        <w:instrText xml:space="preserve"> PAGEREF bm_cap2_objg \h </w:instrText>
-        <w:fldChar w:fldCharType="separate"/>
-        <w:t>?</w:t>
-        <w:fldChar w:fldCharType="end"/>
-      </w:r>
-    </w:p>
-    <w:p>
-      <w:pPr>
-        <w:tabs>
-          <w:tab w:pos="8271" w:val="right" w:leader="dot"/>
-        </w:tabs>
-        <w:spacing w:line="360" w:lineRule="auto" w:before="0" w:after="80"/>
-        <w:ind w:left="283"/>
-      </w:pPr>
-      <w:r>
-        <w:rPr>
-          <w:rFonts w:ascii="Times New Roman" w:hAnsi="Times New Roman"/>
-          <w:b w:val="0"/>
-          <w:sz w:val="24"/>
-        </w:rPr>
-        <w:t>Objetivos Específicos</w:t>
-        <w:tab/>
-      </w:r>
-      <w:r>
-        <w:rPr>
-          <w:rFonts w:ascii="Times New Roman" w:hAnsi="Times New Roman"/>
-          <w:b w:val="0"/>
-          <w:sz w:val="24"/>
-        </w:rPr>
-        <w:fldChar w:fldCharType="begin"/>
-        <w:instrText xml:space="preserve"> PAGEREF bm_cap2_obje \h </w:instrText>
-        <w:fldChar w:fldCharType="separate"/>
-        <w:t>?</w:t>
-        <w:fldChar w:fldCharType="end"/>
-      </w:r>
-    </w:p>
-    <w:p>
-      <w:pPr>
-        <w:tabs>
-          <w:tab w:pos="8271" w:val="right" w:leader="dot"/>
-        </w:tabs>
-        <w:spacing w:line="360" w:lineRule="auto" w:before="0" w:after="80"/>
-        <w:ind w:left="283"/>
-      </w:pPr>
-      <w:r>
-        <w:rPr>
-          <w:rFonts w:ascii="Times New Roman" w:hAnsi="Times New Roman"/>
-          <w:b w:val="0"/>
-          <w:sz w:val="24"/>
-        </w:rPr>
-        <w:t>Planificación integral de objetivos</w:t>
-        <w:tab/>
-      </w:r>
-      <w:r>
-        <w:rPr>
-          <w:rFonts w:ascii="Times New Roman" w:hAnsi="Times New Roman"/>
-          <w:b w:val="0"/>
-          <w:sz w:val="24"/>
-        </w:rPr>
-        <w:fldChar w:fldCharType="begin"/>
-        <w:instrText xml:space="preserve"> PAGEREF bm_cap2_planif \h </w:instrText>
-        <w:fldChar w:fldCharType="separate"/>
-        <w:t>?</w:t>
-        <w:fldChar w:fldCharType="end"/>
-      </w:r>
-    </w:p>
-    <w:p>
-      <w:pPr>
-        <w:tabs>
-          <w:tab w:pos="8271" w:val="right" w:leader="dot"/>
-        </w:tabs>
-        <w:spacing w:line="360" w:lineRule="auto" w:before="0" w:after="80"/>
-        <w:ind w:left="283"/>
-      </w:pPr>
-      <w:r>
-        <w:rPr>
-          <w:rFonts w:ascii="Times New Roman" w:hAnsi="Times New Roman"/>
-          <w:b w:val="0"/>
-          <w:sz w:val="24"/>
-        </w:rPr>
-        <w:t>Cronograma de actividades</w:t>
-        <w:tab/>
-      </w:r>
-      <w:r>
-        <w:rPr>
-          <w:rFonts w:ascii="Times New Roman" w:hAnsi="Times New Roman"/>
-          <w:b w:val="0"/>
-          <w:sz w:val="24"/>
-        </w:rPr>
-        <w:fldChar w:fldCharType="begin"/>
-        <w:instrText xml:space="preserve"> PAGEREF bm_cap2_crono \h </w:instrText>
-        <w:fldChar w:fldCharType="separate"/>
-        <w:t>?</w:t>
-        <w:fldChar w:fldCharType="end"/>
-      </w:r>
-    </w:p>
-    <w:p>
-      <w:pPr>
-        <w:tabs>
-          <w:tab w:pos="8271" w:val="right" w:leader="dot"/>
-        </w:tabs>
-        <w:spacing w:line="360" w:lineRule="auto" w:before="0" w:after="80"/>
-        <w:ind w:left="0"/>
-      </w:pPr>
-      <w:r>
-        <w:rPr>
-          <w:rFonts w:ascii="Times New Roman" w:hAnsi="Times New Roman"/>
-          <w:b/>
-          <w:sz w:val="24"/>
-        </w:rPr>
-        <w:t>III MARCO TEÓRICO</w:t>
-        <w:tab/>
-      </w:r>
-      <w:r>
-        <w:rPr>
-          <w:rFonts w:ascii="Times New Roman" w:hAnsi="Times New Roman"/>
-          <w:b/>
-          <w:sz w:val="24"/>
-        </w:rPr>
-        <w:fldChar w:fldCharType="begin"/>
-        <w:instrText xml:space="preserve"> PAGEREF bm_cap3 \h </w:instrText>
-        <w:fldChar w:fldCharType="separate"/>
-        <w:t>?</w:t>
-        <w:fldChar w:fldCharType="end"/>
-      </w:r>
-    </w:p>
-    <w:p>
-      <w:pPr>
-        <w:tabs>
-          <w:tab w:pos="8271" w:val="right" w:leader="dot"/>
-        </w:tabs>
-        <w:spacing w:line="360" w:lineRule="auto" w:before="0" w:after="80"/>
-        <w:ind w:left="283"/>
-      </w:pPr>
-      <w:r>
-        <w:rPr>
-          <w:rFonts w:ascii="Times New Roman" w:hAnsi="Times New Roman"/>
-          <w:b w:val="0"/>
-          <w:sz w:val="24"/>
-        </w:rPr>
-        <w:t>Bases teóricas referenciales</w:t>
-        <w:tab/>
-      </w:r>
-      <w:r>
-        <w:rPr>
-          <w:rFonts w:ascii="Times New Roman" w:hAnsi="Times New Roman"/>
-          <w:b w:val="0"/>
-          <w:sz w:val="24"/>
-        </w:rPr>
-        <w:fldChar w:fldCharType="begin"/>
-        <w:instrText xml:space="preserve"> PAGEREF bm_cap3_bases \h </w:instrText>
-        <w:fldChar w:fldCharType="separate"/>
-        <w:t>?</w:t>
-        <w:fldChar w:fldCharType="end"/>
-      </w:r>
-    </w:p>
-    <w:p>
-      <w:pPr>
-        <w:tabs>
-          <w:tab w:pos="8271" w:val="right" w:leader="dot"/>
-        </w:tabs>
-        <w:spacing w:line="360" w:lineRule="auto" w:before="0" w:after="80"/>
-        <w:ind w:left="0"/>
-      </w:pPr>
-      <w:r>
-        <w:rPr>
-          <w:rFonts w:ascii="Times New Roman" w:hAnsi="Times New Roman"/>
-          <w:b/>
-          <w:sz w:val="24"/>
-        </w:rPr>
-        <w:t>IV ACTIVIDADES REALIZADAS</w:t>
-        <w:tab/>
-      </w:r>
-      <w:r>
-        <w:rPr>
-          <w:rFonts w:ascii="Times New Roman" w:hAnsi="Times New Roman"/>
-          <w:b/>
-          <w:sz w:val="24"/>
-        </w:rPr>
-        <w:fldChar w:fldCharType="begin"/>
-        <w:instrText xml:space="preserve"> PAGEREF bm_cap4 \h </w:instrText>
-        <w:fldChar w:fldCharType="separate"/>
-        <w:t>?</w:t>
-        <w:fldChar w:fldCharType="end"/>
-      </w:r>
-    </w:p>
-    <w:p>
-      <w:pPr>
-        <w:tabs>
-          <w:tab w:pos="8271" w:val="right" w:leader="dot"/>
-        </w:tabs>
-        <w:spacing w:line="360" w:lineRule="auto" w:before="0" w:after="80"/>
-        <w:ind w:left="283"/>
-      </w:pPr>
-      <w:r>
-        <w:rPr>
-          <w:rFonts w:ascii="Times New Roman" w:hAnsi="Times New Roman"/>
-          <w:b w:val="0"/>
-          <w:sz w:val="24"/>
-        </w:rPr>
-        <w:t>Descripción de actividades ejecutadas por semana</w:t>
-        <w:tab/>
-      </w:r>
-      <w:r>
-        <w:rPr>
-          <w:rFonts w:ascii="Times New Roman" w:hAnsi="Times New Roman"/>
-          <w:b w:val="0"/>
-          <w:sz w:val="24"/>
-        </w:rPr>
-        <w:fldChar w:fldCharType="begin"/>
-        <w:instrText xml:space="preserve"> PAGEREF bm_cap4_desc \h </w:instrText>
-        <w:fldChar w:fldCharType="separate"/>
-        <w:t>?</w:t>
-        <w:fldChar w:fldCharType="end"/>
-      </w:r>
-    </w:p>
-    <w:p>
-      <w:pPr>
-        <w:tabs>
-          <w:tab w:pos="8271" w:val="right" w:leader="dot"/>
-        </w:tabs>
-        <w:spacing w:line="360" w:lineRule="auto" w:before="0" w:after="80"/>
-        <w:ind w:left="0"/>
-      </w:pPr>
-      <w:r>
-        <w:rPr>
-          <w:rFonts w:ascii="Times New Roman" w:hAnsi="Times New Roman"/>
-          <w:b/>
-          <w:sz w:val="24"/>
-        </w:rPr>
-        <w:t>V CONCLUSIONES Y RECOMENDACIONES</w:t>
-        <w:tab/>
-      </w:r>
-      <w:r>
-        <w:rPr>
-          <w:rFonts w:ascii="Times New Roman" w:hAnsi="Times New Roman"/>
-          <w:b/>
-          <w:sz w:val="24"/>
-        </w:rPr>
-        <w:fldChar w:fldCharType="begin"/>
-        <w:instrText xml:space="preserve"> PAGEREF bm_cap5 \h </w:instrText>
-        <w:fldChar w:fldCharType="separate"/>
-        <w:t>?</w:t>
-        <w:fldChar w:fldCharType="end"/>
-      </w:r>
-    </w:p>
-    <w:p>
-      <w:pPr>
-        <w:tabs>
-          <w:tab w:pos="8271" w:val="right" w:leader="dot"/>
-        </w:tabs>
-        <w:spacing w:line="360" w:lineRule="auto" w:before="0" w:after="80"/>
-        <w:ind w:left="283"/>
-      </w:pPr>
-      <w:r>
-        <w:rPr>
-          <w:rFonts w:ascii="Times New Roman" w:hAnsi="Times New Roman"/>
-          <w:b w:val="0"/>
-          <w:sz w:val="24"/>
-        </w:rPr>
-        <w:t>Conclusiones</w:t>
-        <w:tab/>
-      </w:r>
-      <w:r>
-        <w:rPr>
-          <w:rFonts w:ascii="Times New Roman" w:hAnsi="Times New Roman"/>
-          <w:b w:val="0"/>
-          <w:sz w:val="24"/>
-        </w:rPr>
-        <w:fldChar w:fldCharType="begin"/>
-        <w:instrText xml:space="preserve"> PAGEREF bm_cap5_concl \h </w:instrText>
-        <w:fldChar w:fldCharType="separate"/>
-        <w:t>?</w:t>
-        <w:fldChar w:fldCharType="end"/>
-      </w:r>
-    </w:p>
-    <w:p>
-      <w:pPr>
-        <w:tabs>
-          <w:tab w:pos="8271" w:val="right" w:leader="dot"/>
-        </w:tabs>
-        <w:spacing w:line="360" w:lineRule="auto" w:before="0" w:after="80"/>
-        <w:ind w:left="283"/>
-      </w:pPr>
-      <w:r>
-        <w:rPr>
-          <w:rFonts w:ascii="Times New Roman" w:hAnsi="Times New Roman"/>
-          <w:b w:val="0"/>
-          <w:sz w:val="24"/>
-        </w:rPr>
-        <w:t>Recomendaciones</w:t>
-        <w:tab/>
-      </w:r>
-      <w:r>
-        <w:rPr>
-          <w:rFonts w:ascii="Times New Roman" w:hAnsi="Times New Roman"/>
-          <w:b w:val="0"/>
-          <w:sz w:val="24"/>
-        </w:rPr>
-        <w:fldChar w:fldCharType="begin"/>
-        <w:instrText xml:space="preserve"> PAGEREF bm_cap5_recom \h </w:instrText>
-        <w:fldChar w:fldCharType="separate"/>
-        <w:t>?</w:t>
-        <w:fldChar w:fldCharType="end"/>
-      </w:r>
-    </w:p>
-    <w:p>
-      <w:pPr>
-        <w:tabs>
-          <w:tab w:pos="8271" w:val="right" w:leader="dot"/>
-        </w:tabs>
-        <w:spacing w:line="360" w:lineRule="auto" w:before="0" w:after="80"/>
-        <w:ind w:left="0"/>
-      </w:pPr>
-      <w:r>
-        <w:rPr>
-          <w:rFonts w:ascii="Times New Roman" w:hAnsi="Times New Roman"/>
-          <w:b/>
-          <w:sz w:val="24"/>
-        </w:rPr>
-        <w:t>REFERENCIAS</w:t>
-        <w:tab/>
-      </w:r>
-      <w:r>
-        <w:rPr>
-          <w:rFonts w:ascii="Times New Roman" w:hAnsi="Times New Roman"/>
-          <w:b/>
-          <w:sz w:val="24"/>
-        </w:rPr>
-        <w:fldChar w:fldCharType="begin"/>
-        <w:instrText xml:space="preserve"> PAGEREF bm_referencias \h </w:instrText>
-        <w:fldChar w:fldCharType="separate"/>
-        <w:t>?</w:t>
-        <w:fldChar w:fldCharType="end"/>
-      </w:r>
-    </w:p>
-    <w:p>
-      <w:pPr>
-        <w:tabs>
-          <w:tab w:pos="8271" w:val="right" w:leader="dot"/>
-        </w:tabs>
-        <w:spacing w:line="360" w:lineRule="auto" w:before="0" w:after="80"/>
-        <w:ind w:left="0"/>
-      </w:pPr>
-      <w:r>
-        <w:rPr>
-          <w:rFonts w:ascii="Times New Roman" w:hAnsi="Times New Roman"/>
-          <w:b/>
-          <w:sz w:val="24"/>
-        </w:rPr>
-        <w:t>ANEXOS</w:t>
-        <w:tab/>
-      </w:r>
-      <w:r>
-        <w:rPr>
-          <w:rFonts w:ascii="Times New Roman" w:hAnsi="Times New Roman"/>
-          <w:b/>
-          <w:sz w:val="24"/>
-        </w:rPr>
-        <w:fldChar w:fldCharType="begin"/>
-        <w:instrText xml:space="preserve"> PAGEREF bm_anexos \h </w:instrText>
-        <w:fldChar w:fldCharType="separate"/>
-        <w:t>?</w:t>
-        <w:fldChar w:fldCharType="end"/>
-      </w:r>
-    </w:p>
-    <w:p>
-      <w:pPr>
-        <w:sectPr>
-          <w:footerReference w:type="default" r:id="rId20"/>
-          <w:type w:val="continuous"/>
-          <w:pgSz w:w="12240" w:h="15840"/>
-          <w:pgMar w:top="1701" w:right="1701" w:bottom="1701" w:left="2268" w:header="720" w:footer="720" w:gutter="0"/>
-          <w:cols w:space="720"/>
-          <w:titlePg/>
-          <w:docGrid w:linePitch="360"/>
-        </w:sectPr>
-      </w:pPr>
-    </w:p>
-    <w:p>
-      <w:bookmarkStart w:id="bm_lista_cuadros" w:name="bm_lista_cuadros"/>
-      <w:pPr>
-        <w:spacing w:after="480"/>
-        <w:jc w:val="center"/>
-      </w:pPr>
-      <w:r>
-        <w:rPr>
-          <w:rFonts w:ascii="Times New Roman" w:hAnsi="Times New Roman"/>
-          <w:b/>
-          <w:sz w:val="24"/>
-        </w:rPr>
-        <w:t>LISTA DE CUADROS</w:t>
-      </w:r>
-      <w:bookmarkEnd w:id="bm_lista_cuadros"/>
-    </w:p>
-    <w:p>
-      <w:pPr>
-        <w:sectPr>
-          <w:footerReference w:type="default" r:id="rId21"/>
-          <w:pgSz w:w="12240" w:h="15840"/>
-          <w:pgMar w:top="2835" w:right="1701" w:bottom="1701" w:left="2268" w:header="720" w:footer="720" w:gutter="0"/>
-          <w:cols w:space="720"/>
-          <w:titlePg/>
-          <w:docGrid w:linePitch="360"/>
-        </w:sectPr>
-      </w:pPr>
-    </w:p>
-    <w:p>
-      <w:pPr>
-        <w:tabs>
-          <w:tab w:pos="8271" w:val="right"/>
-        </w:tabs>
-        <w:spacing w:before="240" w:after="240"/>
-      </w:pPr>
-      <w:r>
-        <w:rPr>
-          <w:rFonts w:ascii="Times New Roman" w:hAnsi="Times New Roman"/>
-          <w:b/>
-          <w:sz w:val="24"/>
-        </w:rPr>
-        <w:t>CUADRO</w:t>
-      </w:r>
-      <w:r>
-        <w:tab/>
-      </w:r>
-      <w:r>
-        <w:rPr>
-          <w:rFonts w:ascii="Times New Roman" w:hAnsi="Times New Roman"/>
-          <w:b/>
-          <w:sz w:val="24"/>
-        </w:rPr>
-        <w:t>pp.</w:t>
-      </w:r>
-    </w:p>
-    <w:p>
-      <w:pPr>
-        <w:tabs>
-          <w:tab w:pos="1020" w:val="left"/>
-          <w:tab w:pos="8271" w:val="right" w:leader="dot"/>
-        </w:tabs>
-        <w:spacing w:line="360" w:lineRule="auto" w:before="0" w:after="80"/>
-        <w:ind w:left="1020" w:hanging="1020"/>
-      </w:pPr>
-      <w:r>
-        <w:rPr>
-          <w:rFonts w:ascii="Times New Roman" w:hAnsi="Times New Roman"/>
-          <w:sz w:val="24"/>
-        </w:rPr>
-        <w:t>1</w:t>
-        <w:tab/>
-        <w:t>Planificación integral de objetivos específicos</w:t>
-        <w:tab/>
-      </w:r>
-      <w:r>
-        <w:rPr>
-          <w:rFonts w:ascii="Times New Roman" w:hAnsi="Times New Roman"/>
-          <w:b w:val="0"/>
-          <w:sz w:val="24"/>
-        </w:rPr>
-        <w:fldChar w:fldCharType="begin"/>
-        <w:instrText xml:space="preserve"> PAGEREF bm_cuadro1 \h </w:instrText>
-        <w:fldChar w:fldCharType="separate"/>
-        <w:t>?</w:t>
-        <w:fldChar w:fldCharType="end"/>
-      </w:r>
-    </w:p>
-    <w:p>
-      <w:pPr>
-        <w:tabs>
-          <w:tab w:pos="1020" w:val="left"/>
-          <w:tab w:pos="8271" w:val="right" w:leader="dot"/>
-        </w:tabs>
-        <w:spacing w:line="360" w:lineRule="auto" w:before="0" w:after="80"/>
-        <w:ind w:left="1020" w:hanging="1020"/>
-      </w:pPr>
-      <w:r>
-        <w:rPr>
-          <w:rFonts w:ascii="Times New Roman" w:hAnsi="Times New Roman"/>
-          <w:sz w:val="24"/>
-        </w:rPr>
-        <w:t>2</w:t>
-        <w:tab/>
-        <w:t>Cronograma de actividades del proyecto factible</w:t>
-        <w:tab/>
-      </w:r>
-      <w:r>
-        <w:rPr>
-          <w:rFonts w:ascii="Times New Roman" w:hAnsi="Times New Roman"/>
-          <w:b w:val="0"/>
-          <w:sz w:val="24"/>
-        </w:rPr>
-        <w:fldChar w:fldCharType="begin"/>
-        <w:instrText xml:space="preserve"> PAGEREF bm_cuadro2 \h </w:instrText>
-        <w:fldChar w:fldCharType="separate"/>
-        <w:t>?</w:t>
-        <w:fldChar w:fldCharType="end"/>
-      </w:r>
-    </w:p>
-    <w:p>
-      <w:pPr>
-        <w:sectPr>
-          <w:footerReference w:type="default" r:id="rId22"/>
-          <w:type w:val="continuous"/>
-          <w:pgSz w:w="12240" w:h="15840"/>
-          <w:pgMar w:top="1701" w:right="1701" w:bottom="1701" w:left="2268" w:header="720" w:footer="720" w:gutter="0"/>
-          <w:cols w:space="720"/>
-          <w:titlePg/>
-          <w:docGrid w:linePitch="360"/>
-        </w:sectPr>
-      </w:pPr>
-    </w:p>
-    <w:p>
-      <w:bookmarkStart w:id="bm_lista_graficos" w:name="bm_lista_graficos"/>
-      <w:pPr>
-        <w:spacing w:after="480"/>
-        <w:jc w:val="center"/>
-      </w:pPr>
-      <w:r>
-        <w:rPr>
-          <w:rFonts w:ascii="Times New Roman" w:hAnsi="Times New Roman"/>
-          <w:b/>
-          <w:sz w:val="24"/>
-        </w:rPr>
-        <w:t>LISTA DE GRÁFICOS</w:t>
-      </w:r>
-      <w:bookmarkEnd w:id="bm_lista_graficos"/>
-    </w:p>
-    <w:p>
-      <w:pPr>
-        <w:sectPr>
-          <w:footerReference w:type="default" r:id="rId23"/>
-          <w:pgSz w:w="12240" w:h="15840"/>
-          <w:pgMar w:top="2835" w:right="1701" w:bottom="1701" w:left="2268" w:header="720" w:footer="720" w:gutter="0"/>
-          <w:cols w:space="720"/>
-          <w:titlePg/>
-          <w:docGrid w:linePitch="360"/>
-        </w:sectPr>
-      </w:pPr>
-    </w:p>
-    <w:p>
-      <w:pPr>
-        <w:tabs>
-          <w:tab w:pos="8271" w:val="right"/>
-        </w:tabs>
-        <w:spacing w:before="240" w:after="240"/>
-      </w:pPr>
-      <w:r>
-        <w:rPr>
-          <w:rFonts w:ascii="Times New Roman" w:hAnsi="Times New Roman"/>
-          <w:b/>
-          <w:sz w:val="24"/>
-        </w:rPr>
-        <w:t>GRÁFICO</w:t>
-      </w:r>
-      <w:r>
-        <w:tab/>
-      </w:r>
-      <w:r>
-        <w:rPr>
-          <w:rFonts w:ascii="Times New Roman" w:hAnsi="Times New Roman"/>
-          <w:b/>
-          <w:sz w:val="24"/>
-        </w:rPr>
-        <w:t>pp.</w:t>
-      </w:r>
-    </w:p>
-    <w:p>
-      <w:pPr>
-        <w:tabs>
-          <w:tab w:pos="1020" w:val="left"/>
-          <w:tab w:pos="8271" w:val="right" w:leader="dot"/>
-        </w:tabs>
-        <w:spacing w:line="360" w:lineRule="auto" w:before="0" w:after="80"/>
-        <w:ind w:left="1020" w:hanging="1020"/>
-      </w:pPr>
-      <w:r>
-        <w:rPr>
-          <w:rFonts w:ascii="Times New Roman" w:hAnsi="Times New Roman"/>
-          <w:sz w:val="24"/>
-        </w:rPr>
-        <w:t>1</w:t>
-        <w:tab/>
-        <w:t>Organigrama estructural y niveles jerárquicos de Venangocupet, S.A.</w:t>
-        <w:tab/>
-      </w:r>
-      <w:r>
-        <w:rPr>
-          <w:rFonts w:ascii="Times New Roman" w:hAnsi="Times New Roman"/>
-          <w:b w:val="0"/>
-          <w:sz w:val="24"/>
-        </w:rPr>
-        <w:fldChar w:fldCharType="begin"/>
-        <w:instrText xml:space="preserve"> PAGEREF bm_grafico1 \h </w:instrText>
-        <w:fldChar w:fldCharType="separate"/>
-        <w:t>?</w:t>
-        <w:fldChar w:fldCharType="end"/>
-      </w:r>
-    </w:p>
-    <w:p>
-      <w:pPr>
-        <w:tabs>
-          <w:tab w:pos="1020" w:val="left"/>
-          <w:tab w:pos="8271" w:val="right" w:leader="dot"/>
-        </w:tabs>
-        <w:spacing w:line="360" w:lineRule="auto" w:before="0" w:after="80"/>
-        <w:ind w:left="1020" w:hanging="1020"/>
-      </w:pPr>
-      <w:r>
-        <w:rPr>
-          <w:rFonts w:ascii="Times New Roman" w:hAnsi="Times New Roman"/>
-          <w:sz w:val="24"/>
-        </w:rPr>
-        <w:t>2</w:t>
-        <w:tab/>
-        <w:t>Organigrama del Departamento de Presidencia.</w:t>
-        <w:tab/>
-      </w:r>
-      <w:r>
-        <w:rPr>
-          <w:rFonts w:ascii="Times New Roman" w:hAnsi="Times New Roman"/>
-          <w:b w:val="0"/>
-          <w:sz w:val="24"/>
-        </w:rPr>
-        <w:fldChar w:fldCharType="begin"/>
-        <w:instrText xml:space="preserve"> PAGEREF bm_grafico2 \h </w:instrText>
-        <w:fldChar w:fldCharType="separate"/>
-        <w:t>?</w:t>
-        <w:fldChar w:fldCharType="end"/>
-      </w:r>
-    </w:p>
-    <w:p>
-      <w:pPr>
-        <w:sectPr>
-          <w:footerReference w:type="default" r:id="rId24"/>
-          <w:type w:val="continuous"/>
-          <w:pgSz w:w="12240" w:h="15840"/>
-          <w:pgMar w:top="1701" w:right="1701" w:bottom="1701" w:left="2268" w:header="720" w:footer="720" w:gutter="0"/>
-          <w:cols w:space="720"/>
-          <w:titlePg/>
-          <w:docGrid w:linePitch="360"/>
-        </w:sectPr>
-      </w:pPr>
-    </w:p>
-    <w:p>
-      <w:bookmarkStart w:id="bm_lista_anexos" w:name="bm_lista_anexos"/>
-      <w:pPr>
-        <w:spacing w:after="480"/>
-        <w:jc w:val="center"/>
-      </w:pPr>
-      <w:r>
-        <w:rPr>
-          <w:rFonts w:ascii="Times New Roman" w:hAnsi="Times New Roman"/>
-          <w:b/>
-          <w:sz w:val="24"/>
-        </w:rPr>
-        <w:t>LISTA DE ANEXOS</w:t>
-      </w:r>
-      <w:bookmarkEnd w:id="bm_lista_anexos"/>
-    </w:p>
-    <w:p>
-      <w:pPr>
-        <w:sectPr>
-          <w:footerReference w:type="default" r:id="rId25"/>
-          <w:pgSz w:w="12240" w:h="15840"/>
-          <w:pgMar w:top="2835" w:right="1701" w:bottom="1701" w:left="2268" w:header="720" w:footer="720" w:gutter="0"/>
-          <w:cols w:space="720"/>
-          <w:titlePg/>
-          <w:docGrid w:linePitch="360"/>
-        </w:sectPr>
-      </w:pPr>
-    </w:p>
-    <w:p>
-      <w:pPr>
-        <w:tabs>
-          <w:tab w:pos="8271" w:val="right"/>
-        </w:tabs>
-        <w:spacing w:before="240" w:after="240"/>
-      </w:pPr>
-      <w:r>
-        <w:rPr>
-          <w:rFonts w:ascii="Times New Roman" w:hAnsi="Times New Roman"/>
-          <w:b/>
-          <w:sz w:val="24"/>
-        </w:rPr>
-        <w:t>ANEXOS</w:t>
-      </w:r>
-      <w:r>
-        <w:tab/>
-      </w:r>
-      <w:r>
-        <w:rPr>
-          <w:rFonts w:ascii="Times New Roman" w:hAnsi="Times New Roman"/>
-          <w:b/>
-          <w:sz w:val="24"/>
-        </w:rPr>
-        <w:t>pp.</w:t>
-      </w:r>
-    </w:p>
-    <w:p>
-      <w:pPr>
-        <w:tabs>
-          <w:tab w:pos="1020" w:val="left"/>
-          <w:tab w:pos="8271" w:val="right" w:leader="dot"/>
-        </w:tabs>
-        <w:spacing w:line="360" w:lineRule="auto" w:before="0" w:after="80"/>
-        <w:ind w:left="1020" w:hanging="1020"/>
-      </w:pPr>
-      <w:r>
-        <w:rPr>
-          <w:rFonts w:ascii="Times New Roman" w:hAnsi="Times New Roman"/>
-          <w:sz w:val="24"/>
-        </w:rPr>
-        <w:t>A</w:t>
-        <w:tab/>
-        <w:t>Diagrama Entidad-Relación de la Base de Datos</w:t>
-        <w:tab/>
-      </w:r>
-      <w:r>
-        <w:rPr>
-          <w:rFonts w:ascii="Times New Roman" w:hAnsi="Times New Roman"/>
-          <w:b w:val="0"/>
-          <w:sz w:val="24"/>
-        </w:rPr>
-        <w:fldChar w:fldCharType="begin"/>
-        <w:instrText xml:space="preserve"> PAGEREF bm_anexoA \h </w:instrText>
-        <w:fldChar w:fldCharType="separate"/>
-        <w:t>?</w:t>
-        <w:fldChar w:fldCharType="end"/>
-      </w:r>
-    </w:p>
-    <w:p>
-      <w:pPr>
-        <w:tabs>
-          <w:tab w:pos="1020" w:val="left"/>
-          <w:tab w:pos="8271" w:val="right" w:leader="dot"/>
-        </w:tabs>
-        <w:spacing w:line="360" w:lineRule="auto" w:before="0" w:after="80"/>
-        <w:ind w:left="1020" w:hanging="1020"/>
-      </w:pPr>
-      <w:r>
-        <w:rPr>
-          <w:rFonts w:ascii="Times New Roman" w:hAnsi="Times New Roman"/>
-          <w:sz w:val="24"/>
-        </w:rPr>
-        <w:t>B</w:t>
-        <w:tab/>
-        <w:t>Capturas de la Interfaz del Sistema (Wails/HTML)</w:t>
-        <w:tab/>
-      </w:r>
-      <w:r>
-        <w:rPr>
-          <w:rFonts w:ascii="Times New Roman" w:hAnsi="Times New Roman"/>
-          <w:b w:val="0"/>
-          <w:sz w:val="24"/>
-        </w:rPr>
-        <w:fldChar w:fldCharType="begin"/>
-        <w:instrText xml:space="preserve"> PAGEREF bm_anexoB \h </w:instrText>
-        <w:fldChar w:fldCharType="separate"/>
-        <w:t>?</w:t>
-        <w:fldChar w:fldCharType="end"/>
-      </w:r>
-    </w:p>
-    <w:p>
-      <w:pPr>
-        <w:tabs>
-          <w:tab w:pos="1020" w:val="left"/>
-          <w:tab w:pos="8271" w:val="right" w:leader="dot"/>
-        </w:tabs>
-        <w:spacing w:line="360" w:lineRule="auto" w:before="0" w:after="80"/>
-        <w:ind w:left="1020" w:hanging="1020"/>
-      </w:pPr>
-      <w:r>
-        <w:rPr>
-          <w:rFonts w:ascii="Times New Roman" w:hAnsi="Times New Roman"/>
-          <w:sz w:val="24"/>
-        </w:rPr>
-        <w:t>C</w:t>
-        <w:tab/>
-        <w:t>Memoria Fotográfica del Área de Presidencia</w:t>
-        <w:tab/>
-      </w:r>
-      <w:r>
-        <w:rPr>
-          <w:rFonts w:ascii="Times New Roman" w:hAnsi="Times New Roman"/>
-          <w:b w:val="0"/>
-          <w:sz w:val="24"/>
-        </w:rPr>
-        <w:fldChar w:fldCharType="begin"/>
-        <w:instrText xml:space="preserve"> PAGEREF bm_anexoC \h </w:instrText>
-        <w:fldChar w:fldCharType="separate"/>
-        <w:t>?</w:t>
-        <w:fldChar w:fldCharType="end"/>
-      </w:r>
-    </w:p>
-    <w:p>
-      <w:pPr>
-        <w:sectPr>
-          <w:footerReference w:type="default" r:id="rId26"/>
-          <w:type w:val="continuous"/>
-          <w:pgSz w:w="12240" w:h="15840"/>
-          <w:pgMar w:top="1701" w:right="1701" w:bottom="1701" w:left="2268" w:header="720" w:footer="720" w:gutter="0"/>
-          <w:cols w:space="720"/>
-          <w:titlePg/>
-          <w:docGrid w:linePitch="360"/>
-        </w:sectPr>
-      </w:pPr>
-    </w:p>
-    <w:p>
-      <w:bookmarkStart w:id="bm_introduccion" w:name="bm_introduccion"/>
-      <w:pPr>
-        <w:spacing w:after="480"/>
-        <w:jc w:val="center"/>
-      </w:pPr>
-      <w:r>
-        <w:rPr>
-          <w:rFonts w:ascii="Times New Roman" w:hAnsi="Times New Roman"/>
-          <w:b/>
-          <w:sz w:val="24"/>
-        </w:rPr>
-        <w:t>INTRODUCCIÓN</w:t>
-      </w:r>
-      <w:bookmarkEnd w:id="bm_introduccion"/>
-    </w:p>
-    <w:p>
-      <w:pPr>
-        <w:sectPr>
-          <w:footerReference w:type="default" r:id="rId27"/>
-          <w:pgSz w:w="12240" w:h="15840"/>
-          <w:pgMar w:top="2835" w:right="1701" w:bottom="1701" w:left="2268" w:header="720" w:footer="720" w:gutter="0"/>
-          <w:cols w:space="720"/>
-          <w:titlePg/>
-          <w:docGrid w:linePitch="360"/>
-        </w:sectPr>
-      </w:pPr>
-    </w:p>
-    <w:p>
-      <w:pPr>
-        <w:spacing w:line="360" w:lineRule="auto" w:after="0" w:before="0"/>
-        <w:ind w:firstLine="709"/>
-        <w:jc w:val="both"/>
-      </w:pPr>
-      <w:r>
-        <w:rPr>
-          <w:rFonts w:ascii="Times New Roman" w:hAnsi="Times New Roman"/>
-          <w:i w:val="0"/>
-          <w:sz w:val="24"/>
-        </w:rPr>
-        <w:t>La presente pasantía, desarrollada como requisito para optar al título de Técnico Superior Universitario en Informática, tiene como propósito proponer un sistema automatizado para el control de movimientos documentales en la Presidencia de Venangocupet, S.A. Este desarrollo busca sustituir el registro manual por una herramienta tecnológica de escritorio ágil y moderna, que garantice la trazabilidad de los expedientes, optimizando los tiempos de respuesta y dotando al departamento de un control exacto sobre la entrada y salida de oficios en alta dirección.</w:t>
-      </w:r>
-    </w:p>
-    <w:p>
-      <w:pPr>
-        <w:sectPr>
-          <w:footerReference w:type="default" r:id="rId28"/>
-          <w:type w:val="continuous"/>
-          <w:pgSz w:w="12240" w:h="15840"/>
-          <w:pgMar w:top="1701" w:right="1701" w:bottom="1701" w:left="2268" w:header="720" w:footer="720" w:gutter="0"/>
-          <w:cols w:space="720"/>
-          <w:titlePg/>
-          <w:docGrid w:linePitch="360"/>
-        </w:sectPr>
-      </w:pPr>
-    </w:p>
-    <w:p>
-      <w:pPr>
         <w:spacing w:after="480"/>
         <w:jc w:val="center"/>
       </w:pPr>
@@ -1992,7 +146,7 @@
     <w:p>
       <w:pPr>
         <w:sectPr>
-          <w:footerReference w:type="default" r:id="rId29"/>
+          <w:footerReference w:type="default" r:id="rId12"/>
           <w:pgSz w:w="12240" w:h="15840"/>
           <w:pgMar w:top="2835" w:right="1701" w:bottom="1701" w:left="2268" w:header="720" w:footer="720" w:gutter="0"/>
           <w:cols w:space="720"/>
@@ -2667,7 +821,7 @@
     <w:p>
       <w:pPr>
         <w:sectPr>
-          <w:footerReference w:type="default" r:id="rId30"/>
+          <w:footerReference w:type="default" r:id="rId13"/>
           <w:type w:val="continuous"/>
           <w:pgSz w:w="12240" w:h="15840"/>
           <w:pgMar w:top="1701" w:right="1701" w:bottom="1701" w:left="2268" w:header="720" w:footer="720" w:gutter="0"/>
@@ -2710,7 +864,7 @@
     <w:p>
       <w:pPr>
         <w:sectPr>
-          <w:footerReference w:type="default" r:id="rId31"/>
+          <w:footerReference w:type="default" r:id="rId14"/>
           <w:pgSz w:w="12240" w:h="15840"/>
           <w:pgMar w:top="2835" w:right="1701" w:bottom="1701" w:left="2268" w:header="720" w:footer="720" w:gutter="0"/>
           <w:cols w:space="720"/>
@@ -5150,7 +3304,7 @@
     </w:tbl>
     <w:p/>
     <w:sectPr>
-      <w:footerReference w:type="default" r:id="rId32"/>
+      <w:footerReference w:type="default" r:id="rId15"/>
       <w:type w:val="continuous"/>
       <w:pgSz w:w="12240" w:h="15840"/>
       <w:pgMar w:top="1701" w:right="1701" w:bottom="1701" w:left="2268" w:header="720" w:footer="720" w:gutter="0"/>
@@ -5172,269 +3326,7 @@
 </w:ftr>
 </file>
 
-<file path=word/footer10.xml><?xml version="1.0" encoding="utf-8"?>
-<w:ftr xmlns:m="http://schemas.openxmlformats.org/officeDocument/2006/math" xmlns:mc="http://schemas.openxmlformats.org/markup-compatibility/2006" xmlns:mo="http://schemas.microsoft.com/office/mac/office/2008/main" xmlns:mv="urn:schemas-microsoft-com:mac:vml" xmlns:o="urn:schemas-microsoft-com:office:office" xmlns:r="http://schemas.openxmlformats.org/officeDocument/2006/relationships" xmlns:v="urn:schemas-microsoft-com:vml" xmlns:w10="urn:schemas-microsoft-com:office:word" xmlns:w14="http://schemas.microsoft.com/office/word/2010/wordml" xmlns:w="http://schemas.openxmlformats.org/wordprocessingml/2006/main" xmlns:wne="http://schemas.microsoft.com/office/word/2006/wordml" xmlns:wp14="http://schemas.microsoft.com/office/word/2010/wordprocessingDrawing" xmlns:wp="http://schemas.openxmlformats.org/drawingml/2006/wordprocessingDrawing" xmlns:wpc="http://schemas.microsoft.com/office/word/2010/wordprocessingCanvas" xmlns:wpg="http://schemas.microsoft.com/office/word/2010/wordprocessingGroup" xmlns:wpi="http://schemas.microsoft.com/office/word/2010/wordprocessingInk" xmlns:wps="http://schemas.microsoft.com/office/word/2010/wordprocessingShape" mc:Ignorable="w14 wp14">
-  <w:p>
-    <w:pPr>
-      <w:pStyle w:val="Footer"/>
-      <w:jc w:val="center"/>
-    </w:pPr>
-    <w:r>
-      <w:rPr>
-        <w:rFonts w:ascii="Times New Roman" w:hAnsi="Times New Roman"/>
-        <w:sz w:val="24"/>
-      </w:rPr>
-      <w:fldChar w:fldCharType="begin"/>
-      <w:instrText xml:space="preserve"> PAGE \* roman </w:instrText>
-      <w:fldChar w:fldCharType="separate"/>
-      <w:fldChar w:fldCharType="end"/>
-    </w:r>
-  </w:p>
-</w:ftr>
-</file>
-
-<file path=word/footer11.xml><?xml version="1.0" encoding="utf-8"?>
-<w:ftr xmlns:m="http://schemas.openxmlformats.org/officeDocument/2006/math" xmlns:mc="http://schemas.openxmlformats.org/markup-compatibility/2006" xmlns:mo="http://schemas.microsoft.com/office/mac/office/2008/main" xmlns:mv="urn:schemas-microsoft-com:mac:vml" xmlns:o="urn:schemas-microsoft-com:office:office" xmlns:r="http://schemas.openxmlformats.org/officeDocument/2006/relationships" xmlns:v="urn:schemas-microsoft-com:vml" xmlns:w10="urn:schemas-microsoft-com:office:word" xmlns:w14="http://schemas.microsoft.com/office/word/2010/wordml" xmlns:w="http://schemas.openxmlformats.org/wordprocessingml/2006/main" xmlns:wne="http://schemas.microsoft.com/office/word/2006/wordml" xmlns:wp14="http://schemas.microsoft.com/office/word/2010/wordprocessingDrawing" xmlns:wp="http://schemas.openxmlformats.org/drawingml/2006/wordprocessingDrawing" xmlns:wpc="http://schemas.microsoft.com/office/word/2010/wordprocessingCanvas" xmlns:wpg="http://schemas.microsoft.com/office/word/2010/wordprocessingGroup" xmlns:wpi="http://schemas.microsoft.com/office/word/2010/wordprocessingInk" xmlns:wps="http://schemas.microsoft.com/office/word/2010/wordprocessingShape" mc:Ignorable="w14 wp14">
-  <w:p>
-    <w:pPr>
-      <w:pStyle w:val="Footer"/>
-      <w:jc w:val="center"/>
-    </w:pPr>
-    <w:r>
-      <w:rPr>
-        <w:rFonts w:ascii="Times New Roman" w:hAnsi="Times New Roman"/>
-        <w:sz w:val="24"/>
-      </w:rPr>
-      <w:fldChar w:fldCharType="begin"/>
-      <w:instrText xml:space="preserve"> PAGE \* roman </w:instrText>
-      <w:fldChar w:fldCharType="separate"/>
-      <w:fldChar w:fldCharType="end"/>
-    </w:r>
-  </w:p>
-</w:ftr>
-</file>
-
-<file path=word/footer12.xml><?xml version="1.0" encoding="utf-8"?>
-<w:ftr xmlns:m="http://schemas.openxmlformats.org/officeDocument/2006/math" xmlns:mc="http://schemas.openxmlformats.org/markup-compatibility/2006" xmlns:mo="http://schemas.microsoft.com/office/mac/office/2008/main" xmlns:mv="urn:schemas-microsoft-com:mac:vml" xmlns:o="urn:schemas-microsoft-com:office:office" xmlns:r="http://schemas.openxmlformats.org/officeDocument/2006/relationships" xmlns:v="urn:schemas-microsoft-com:vml" xmlns:w10="urn:schemas-microsoft-com:office:word" xmlns:w14="http://schemas.microsoft.com/office/word/2010/wordml" xmlns:w="http://schemas.openxmlformats.org/wordprocessingml/2006/main" xmlns:wne="http://schemas.microsoft.com/office/word/2006/wordml" xmlns:wp14="http://schemas.microsoft.com/office/word/2010/wordprocessingDrawing" xmlns:wp="http://schemas.openxmlformats.org/drawingml/2006/wordprocessingDrawing" xmlns:wpc="http://schemas.microsoft.com/office/word/2010/wordprocessingCanvas" xmlns:wpg="http://schemas.microsoft.com/office/word/2010/wordprocessingGroup" xmlns:wpi="http://schemas.microsoft.com/office/word/2010/wordprocessingInk" xmlns:wps="http://schemas.microsoft.com/office/word/2010/wordprocessingShape" mc:Ignorable="w14 wp14">
-  <w:p>
-    <w:pPr>
-      <w:pStyle w:val="Footer"/>
-      <w:jc w:val="center"/>
-    </w:pPr>
-    <w:r>
-      <w:rPr>
-        <w:rFonts w:ascii="Times New Roman" w:hAnsi="Times New Roman"/>
-        <w:sz w:val="24"/>
-      </w:rPr>
-      <w:fldChar w:fldCharType="begin"/>
-      <w:instrText xml:space="preserve"> PAGE \* roman </w:instrText>
-      <w:fldChar w:fldCharType="separate"/>
-      <w:fldChar w:fldCharType="end"/>
-    </w:r>
-  </w:p>
-</w:ftr>
-</file>
-
-<file path=word/footer13.xml><?xml version="1.0" encoding="utf-8"?>
-<w:ftr xmlns:m="http://schemas.openxmlformats.org/officeDocument/2006/math" xmlns:mc="http://schemas.openxmlformats.org/markup-compatibility/2006" xmlns:mo="http://schemas.microsoft.com/office/mac/office/2008/main" xmlns:mv="urn:schemas-microsoft-com:mac:vml" xmlns:o="urn:schemas-microsoft-com:office:office" xmlns:r="http://schemas.openxmlformats.org/officeDocument/2006/relationships" xmlns:v="urn:schemas-microsoft-com:vml" xmlns:w10="urn:schemas-microsoft-com:office:word" xmlns:w14="http://schemas.microsoft.com/office/word/2010/wordml" xmlns:w="http://schemas.openxmlformats.org/wordprocessingml/2006/main" xmlns:wne="http://schemas.microsoft.com/office/word/2006/wordml" xmlns:wp14="http://schemas.microsoft.com/office/word/2010/wordprocessingDrawing" xmlns:wp="http://schemas.openxmlformats.org/drawingml/2006/wordprocessingDrawing" xmlns:wpc="http://schemas.microsoft.com/office/word/2010/wordprocessingCanvas" xmlns:wpg="http://schemas.microsoft.com/office/word/2010/wordprocessingGroup" xmlns:wpi="http://schemas.microsoft.com/office/word/2010/wordprocessingInk" xmlns:wps="http://schemas.microsoft.com/office/word/2010/wordprocessingShape" mc:Ignorable="w14 wp14">
-  <w:p>
-    <w:pPr>
-      <w:pStyle w:val="Footer"/>
-      <w:jc w:val="center"/>
-    </w:pPr>
-    <w:r>
-      <w:rPr>
-        <w:rFonts w:ascii="Times New Roman" w:hAnsi="Times New Roman"/>
-        <w:sz w:val="24"/>
-      </w:rPr>
-      <w:fldChar w:fldCharType="begin"/>
-      <w:instrText xml:space="preserve"> PAGE \* roman </w:instrText>
-      <w:fldChar w:fldCharType="separate"/>
-      <w:fldChar w:fldCharType="end"/>
-    </w:r>
-  </w:p>
-</w:ftr>
-</file>
-
-<file path=word/footer14.xml><?xml version="1.0" encoding="utf-8"?>
-<w:ftr xmlns:m="http://schemas.openxmlformats.org/officeDocument/2006/math" xmlns:mc="http://schemas.openxmlformats.org/markup-compatibility/2006" xmlns:mo="http://schemas.microsoft.com/office/mac/office/2008/main" xmlns:mv="urn:schemas-microsoft-com:mac:vml" xmlns:o="urn:schemas-microsoft-com:office:office" xmlns:r="http://schemas.openxmlformats.org/officeDocument/2006/relationships" xmlns:v="urn:schemas-microsoft-com:vml" xmlns:w10="urn:schemas-microsoft-com:office:word" xmlns:w14="http://schemas.microsoft.com/office/word/2010/wordml" xmlns:w="http://schemas.openxmlformats.org/wordprocessingml/2006/main" xmlns:wne="http://schemas.microsoft.com/office/word/2006/wordml" xmlns:wp14="http://schemas.microsoft.com/office/word/2010/wordprocessingDrawing" xmlns:wp="http://schemas.openxmlformats.org/drawingml/2006/wordprocessingDrawing" xmlns:wpc="http://schemas.microsoft.com/office/word/2010/wordprocessingCanvas" xmlns:wpg="http://schemas.microsoft.com/office/word/2010/wordprocessingGroup" xmlns:wpi="http://schemas.microsoft.com/office/word/2010/wordprocessingInk" xmlns:wps="http://schemas.microsoft.com/office/word/2010/wordprocessingShape" mc:Ignorable="w14 wp14">
-  <w:p>
-    <w:pPr>
-      <w:pStyle w:val="Footer"/>
-      <w:jc w:val="center"/>
-    </w:pPr>
-    <w:r>
-      <w:rPr>
-        <w:rFonts w:ascii="Times New Roman" w:hAnsi="Times New Roman"/>
-        <w:sz w:val="24"/>
-      </w:rPr>
-      <w:fldChar w:fldCharType="begin"/>
-      <w:instrText xml:space="preserve"> PAGE \* roman </w:instrText>
-      <w:fldChar w:fldCharType="separate"/>
-      <w:fldChar w:fldCharType="end"/>
-    </w:r>
-  </w:p>
-</w:ftr>
-</file>
-
-<file path=word/footer15.xml><?xml version="1.0" encoding="utf-8"?>
-<w:ftr xmlns:m="http://schemas.openxmlformats.org/officeDocument/2006/math" xmlns:mc="http://schemas.openxmlformats.org/markup-compatibility/2006" xmlns:mo="http://schemas.microsoft.com/office/mac/office/2008/main" xmlns:mv="urn:schemas-microsoft-com:mac:vml" xmlns:o="urn:schemas-microsoft-com:office:office" xmlns:r="http://schemas.openxmlformats.org/officeDocument/2006/relationships" xmlns:v="urn:schemas-microsoft-com:vml" xmlns:w10="urn:schemas-microsoft-com:office:word" xmlns:w14="http://schemas.microsoft.com/office/word/2010/wordml" xmlns:w="http://schemas.openxmlformats.org/wordprocessingml/2006/main" xmlns:wne="http://schemas.microsoft.com/office/word/2006/wordml" xmlns:wp14="http://schemas.microsoft.com/office/word/2010/wordprocessingDrawing" xmlns:wp="http://schemas.openxmlformats.org/drawingml/2006/wordprocessingDrawing" xmlns:wpc="http://schemas.microsoft.com/office/word/2010/wordprocessingCanvas" xmlns:wpg="http://schemas.microsoft.com/office/word/2010/wordprocessingGroup" xmlns:wpi="http://schemas.microsoft.com/office/word/2010/wordprocessingInk" xmlns:wps="http://schemas.microsoft.com/office/word/2010/wordprocessingShape" mc:Ignorable="w14 wp14">
-  <w:p>
-    <w:pPr>
-      <w:pStyle w:val="Footer"/>
-      <w:jc w:val="center"/>
-    </w:pPr>
-    <w:r>
-      <w:rPr>
-        <w:rFonts w:ascii="Times New Roman" w:hAnsi="Times New Roman"/>
-        <w:sz w:val="24"/>
-      </w:rPr>
-      <w:fldChar w:fldCharType="begin"/>
-      <w:instrText xml:space="preserve"> PAGE \* roman </w:instrText>
-      <w:fldChar w:fldCharType="separate"/>
-      <w:fldChar w:fldCharType="end"/>
-    </w:r>
-  </w:p>
-</w:ftr>
-</file>
-
-<file path=word/footer16.xml><?xml version="1.0" encoding="utf-8"?>
-<w:ftr xmlns:m="http://schemas.openxmlformats.org/officeDocument/2006/math" xmlns:mc="http://schemas.openxmlformats.org/markup-compatibility/2006" xmlns:mo="http://schemas.microsoft.com/office/mac/office/2008/main" xmlns:mv="urn:schemas-microsoft-com:mac:vml" xmlns:o="urn:schemas-microsoft-com:office:office" xmlns:r="http://schemas.openxmlformats.org/officeDocument/2006/relationships" xmlns:v="urn:schemas-microsoft-com:vml" xmlns:w10="urn:schemas-microsoft-com:office:word" xmlns:w14="http://schemas.microsoft.com/office/word/2010/wordml" xmlns:w="http://schemas.openxmlformats.org/wordprocessingml/2006/main" xmlns:wne="http://schemas.microsoft.com/office/word/2006/wordml" xmlns:wp14="http://schemas.microsoft.com/office/word/2010/wordprocessingDrawing" xmlns:wp="http://schemas.openxmlformats.org/drawingml/2006/wordprocessingDrawing" xmlns:wpc="http://schemas.microsoft.com/office/word/2010/wordprocessingCanvas" xmlns:wpg="http://schemas.microsoft.com/office/word/2010/wordprocessingGroup" xmlns:wpi="http://schemas.microsoft.com/office/word/2010/wordprocessingInk" xmlns:wps="http://schemas.microsoft.com/office/word/2010/wordprocessingShape" mc:Ignorable="w14 wp14">
-  <w:p>
-    <w:pPr>
-      <w:pStyle w:val="Footer"/>
-      <w:jc w:val="center"/>
-    </w:pPr>
-    <w:r>
-      <w:rPr>
-        <w:rFonts w:ascii="Times New Roman" w:hAnsi="Times New Roman"/>
-        <w:sz w:val="24"/>
-      </w:rPr>
-      <w:fldChar w:fldCharType="begin"/>
-      <w:instrText xml:space="preserve"> PAGE \* roman </w:instrText>
-      <w:fldChar w:fldCharType="separate"/>
-      <w:fldChar w:fldCharType="end"/>
-    </w:r>
-  </w:p>
-</w:ftr>
-</file>
-
-<file path=word/footer17.xml><?xml version="1.0" encoding="utf-8"?>
-<w:ftr xmlns:m="http://schemas.openxmlformats.org/officeDocument/2006/math" xmlns:mc="http://schemas.openxmlformats.org/markup-compatibility/2006" xmlns:mo="http://schemas.microsoft.com/office/mac/office/2008/main" xmlns:mv="urn:schemas-microsoft-com:mac:vml" xmlns:o="urn:schemas-microsoft-com:office:office" xmlns:r="http://schemas.openxmlformats.org/officeDocument/2006/relationships" xmlns:v="urn:schemas-microsoft-com:vml" xmlns:w10="urn:schemas-microsoft-com:office:word" xmlns:w14="http://schemas.microsoft.com/office/word/2010/wordml" xmlns:w="http://schemas.openxmlformats.org/wordprocessingml/2006/main" xmlns:wne="http://schemas.microsoft.com/office/word/2006/wordml" xmlns:wp14="http://schemas.microsoft.com/office/word/2010/wordprocessingDrawing" xmlns:wp="http://schemas.openxmlformats.org/drawingml/2006/wordprocessingDrawing" xmlns:wpc="http://schemas.microsoft.com/office/word/2010/wordprocessingCanvas" xmlns:wpg="http://schemas.microsoft.com/office/word/2010/wordprocessingGroup" xmlns:wpi="http://schemas.microsoft.com/office/word/2010/wordprocessingInk" xmlns:wps="http://schemas.microsoft.com/office/word/2010/wordprocessingShape" mc:Ignorable="w14 wp14">
-  <w:p>
-    <w:pPr>
-      <w:pStyle w:val="Footer"/>
-      <w:jc w:val="center"/>
-    </w:pPr>
-    <w:r>
-      <w:rPr>
-        <w:rFonts w:ascii="Times New Roman" w:hAnsi="Times New Roman"/>
-        <w:sz w:val="24"/>
-      </w:rPr>
-      <w:fldChar w:fldCharType="begin"/>
-      <w:instrText xml:space="preserve"> PAGE \* roman </w:instrText>
-      <w:fldChar w:fldCharType="separate"/>
-      <w:fldChar w:fldCharType="end"/>
-    </w:r>
-  </w:p>
-</w:ftr>
-</file>
-
-<file path=word/footer18.xml><?xml version="1.0" encoding="utf-8"?>
-<w:ftr xmlns:m="http://schemas.openxmlformats.org/officeDocument/2006/math" xmlns:mc="http://schemas.openxmlformats.org/markup-compatibility/2006" xmlns:mo="http://schemas.microsoft.com/office/mac/office/2008/main" xmlns:mv="urn:schemas-microsoft-com:mac:vml" xmlns:o="urn:schemas-microsoft-com:office:office" xmlns:r="http://schemas.openxmlformats.org/officeDocument/2006/relationships" xmlns:v="urn:schemas-microsoft-com:vml" xmlns:w10="urn:schemas-microsoft-com:office:word" xmlns:w14="http://schemas.microsoft.com/office/word/2010/wordml" xmlns:w="http://schemas.openxmlformats.org/wordprocessingml/2006/main" xmlns:wne="http://schemas.microsoft.com/office/word/2006/wordml" xmlns:wp14="http://schemas.microsoft.com/office/word/2010/wordprocessingDrawing" xmlns:wp="http://schemas.openxmlformats.org/drawingml/2006/wordprocessingDrawing" xmlns:wpc="http://schemas.microsoft.com/office/word/2010/wordprocessingCanvas" xmlns:wpg="http://schemas.microsoft.com/office/word/2010/wordprocessingGroup" xmlns:wpi="http://schemas.microsoft.com/office/word/2010/wordprocessingInk" xmlns:wps="http://schemas.microsoft.com/office/word/2010/wordprocessingShape" mc:Ignorable="w14 wp14">
-  <w:p>
-    <w:pPr>
-      <w:pStyle w:val="Footer"/>
-      <w:jc w:val="center"/>
-    </w:pPr>
-    <w:r>
-      <w:rPr>
-        <w:rFonts w:ascii="Times New Roman" w:hAnsi="Times New Roman"/>
-        <w:sz w:val="24"/>
-      </w:rPr>
-      <w:fldChar w:fldCharType="begin"/>
-      <w:instrText xml:space="preserve"> PAGE \* roman </w:instrText>
-      <w:fldChar w:fldCharType="separate"/>
-      <w:fldChar w:fldCharType="end"/>
-    </w:r>
-  </w:p>
-</w:ftr>
-</file>
-
-<file path=word/footer19.xml><?xml version="1.0" encoding="utf-8"?>
-<w:ftr xmlns:m="http://schemas.openxmlformats.org/officeDocument/2006/math" xmlns:mc="http://schemas.openxmlformats.org/markup-compatibility/2006" xmlns:mo="http://schemas.microsoft.com/office/mac/office/2008/main" xmlns:mv="urn:schemas-microsoft-com:mac:vml" xmlns:o="urn:schemas-microsoft-com:office:office" xmlns:r="http://schemas.openxmlformats.org/officeDocument/2006/relationships" xmlns:v="urn:schemas-microsoft-com:vml" xmlns:w10="urn:schemas-microsoft-com:office:word" xmlns:w14="http://schemas.microsoft.com/office/word/2010/wordml" xmlns:w="http://schemas.openxmlformats.org/wordprocessingml/2006/main" xmlns:wne="http://schemas.microsoft.com/office/word/2006/wordml" xmlns:wp14="http://schemas.microsoft.com/office/word/2010/wordprocessingDrawing" xmlns:wp="http://schemas.openxmlformats.org/drawingml/2006/wordprocessingDrawing" xmlns:wpc="http://schemas.microsoft.com/office/word/2010/wordprocessingCanvas" xmlns:wpg="http://schemas.microsoft.com/office/word/2010/wordprocessingGroup" xmlns:wpi="http://schemas.microsoft.com/office/word/2010/wordprocessingInk" xmlns:wps="http://schemas.microsoft.com/office/word/2010/wordprocessingShape" mc:Ignorable="w14 wp14">
-  <w:p>
-    <w:pPr>
-      <w:pStyle w:val="Footer"/>
-      <w:jc w:val="center"/>
-    </w:pPr>
-    <w:r>
-      <w:rPr>
-        <w:rFonts w:ascii="Times New Roman" w:hAnsi="Times New Roman"/>
-        <w:sz w:val="24"/>
-      </w:rPr>
-      <w:fldChar w:fldCharType="begin"/>
-      <w:instrText xml:space="preserve"> PAGE </w:instrText>
-      <w:fldChar w:fldCharType="separate"/>
-      <w:fldChar w:fldCharType="end"/>
-    </w:r>
-  </w:p>
-</w:ftr>
-</file>
-
 <file path=word/footer2.xml><?xml version="1.0" encoding="utf-8"?>
-<w:ftr xmlns:m="http://schemas.openxmlformats.org/officeDocument/2006/math" xmlns:mc="http://schemas.openxmlformats.org/markup-compatibility/2006" xmlns:mo="http://schemas.microsoft.com/office/mac/office/2008/main" xmlns:mv="urn:schemas-microsoft-com:mac:vml" xmlns:o="urn:schemas-microsoft-com:office:office" xmlns:r="http://schemas.openxmlformats.org/officeDocument/2006/relationships" xmlns:v="urn:schemas-microsoft-com:vml" xmlns:w10="urn:schemas-microsoft-com:office:word" xmlns:w14="http://schemas.microsoft.com/office/word/2010/wordml" xmlns:w="http://schemas.openxmlformats.org/wordprocessingml/2006/main" xmlns:wne="http://schemas.microsoft.com/office/word/2006/wordml" xmlns:wp14="http://schemas.microsoft.com/office/word/2010/wordprocessingDrawing" xmlns:wp="http://schemas.openxmlformats.org/drawingml/2006/wordprocessingDrawing" xmlns:wpc="http://schemas.microsoft.com/office/word/2010/wordprocessingCanvas" xmlns:wpg="http://schemas.microsoft.com/office/word/2010/wordprocessingGroup" xmlns:wpi="http://schemas.microsoft.com/office/word/2010/wordprocessingInk" xmlns:wps="http://schemas.microsoft.com/office/word/2010/wordprocessingShape" mc:Ignorable="w14 wp14">
-  <w:p>
-    <w:pPr>
-      <w:pStyle w:val="Footer"/>
-    </w:pPr>
-  </w:p>
-</w:ftr>
-</file>
-
-<file path=word/footer20.xml><?xml version="1.0" encoding="utf-8"?>
-<w:ftr xmlns:m="http://schemas.openxmlformats.org/officeDocument/2006/math" xmlns:mc="http://schemas.openxmlformats.org/markup-compatibility/2006" xmlns:mo="http://schemas.microsoft.com/office/mac/office/2008/main" xmlns:mv="urn:schemas-microsoft-com:mac:vml" xmlns:o="urn:schemas-microsoft-com:office:office" xmlns:r="http://schemas.openxmlformats.org/officeDocument/2006/relationships" xmlns:v="urn:schemas-microsoft-com:vml" xmlns:w10="urn:schemas-microsoft-com:office:word" xmlns:w14="http://schemas.microsoft.com/office/word/2010/wordml" xmlns:w="http://schemas.openxmlformats.org/wordprocessingml/2006/main" xmlns:wne="http://schemas.microsoft.com/office/word/2006/wordml" xmlns:wp14="http://schemas.microsoft.com/office/word/2010/wordprocessingDrawing" xmlns:wp="http://schemas.openxmlformats.org/drawingml/2006/wordprocessingDrawing" xmlns:wpc="http://schemas.microsoft.com/office/word/2010/wordprocessingCanvas" xmlns:wpg="http://schemas.microsoft.com/office/word/2010/wordprocessingGroup" xmlns:wpi="http://schemas.microsoft.com/office/word/2010/wordprocessingInk" xmlns:wps="http://schemas.microsoft.com/office/word/2010/wordprocessingShape" mc:Ignorable="w14 wp14">
-  <w:p>
-    <w:pPr>
-      <w:pStyle w:val="Footer"/>
-      <w:jc w:val="center"/>
-    </w:pPr>
-    <w:r>
-      <w:rPr>
-        <w:rFonts w:ascii="Times New Roman" w:hAnsi="Times New Roman"/>
-        <w:sz w:val="24"/>
-      </w:rPr>
-      <w:fldChar w:fldCharType="begin"/>
-      <w:instrText xml:space="preserve"> PAGE </w:instrText>
-      <w:fldChar w:fldCharType="separate"/>
-      <w:fldChar w:fldCharType="end"/>
-    </w:r>
-  </w:p>
-</w:ftr>
-</file>
-
-<file path=word/footer21.xml><?xml version="1.0" encoding="utf-8"?>
-<w:ftr xmlns:m="http://schemas.openxmlformats.org/officeDocument/2006/math" xmlns:mc="http://schemas.openxmlformats.org/markup-compatibility/2006" xmlns:mo="http://schemas.microsoft.com/office/mac/office/2008/main" xmlns:mv="urn:schemas-microsoft-com:mac:vml" xmlns:o="urn:schemas-microsoft-com:office:office" xmlns:r="http://schemas.openxmlformats.org/officeDocument/2006/relationships" xmlns:v="urn:schemas-microsoft-com:vml" xmlns:w10="urn:schemas-microsoft-com:office:word" xmlns:w14="http://schemas.microsoft.com/office/word/2010/wordml" xmlns:w="http://schemas.openxmlformats.org/wordprocessingml/2006/main" xmlns:wne="http://schemas.microsoft.com/office/word/2006/wordml" xmlns:wp14="http://schemas.microsoft.com/office/word/2010/wordprocessingDrawing" xmlns:wp="http://schemas.openxmlformats.org/drawingml/2006/wordprocessingDrawing" xmlns:wpc="http://schemas.microsoft.com/office/word/2010/wordprocessingCanvas" xmlns:wpg="http://schemas.microsoft.com/office/word/2010/wordprocessingGroup" xmlns:wpi="http://schemas.microsoft.com/office/word/2010/wordprocessingInk" xmlns:wps="http://schemas.microsoft.com/office/word/2010/wordprocessingShape" mc:Ignorable="w14 wp14">
-  <w:p>
-    <w:pPr>
-      <w:pStyle w:val="Footer"/>
-      <w:jc w:val="center"/>
-    </w:pPr>
-    <w:r>
-      <w:rPr>
-        <w:rFonts w:ascii="Times New Roman" w:hAnsi="Times New Roman"/>
-        <w:sz w:val="24"/>
-      </w:rPr>
-      <w:fldChar w:fldCharType="begin"/>
-      <w:instrText xml:space="preserve"> PAGE </w:instrText>
-      <w:fldChar w:fldCharType="separate"/>
-      <w:fldChar w:fldCharType="end"/>
-    </w:r>
-  </w:p>
-</w:ftr>
-</file>
-
-<file path=word/footer22.xml><?xml version="1.0" encoding="utf-8"?>
 <w:ftr xmlns:m="http://schemas.openxmlformats.org/officeDocument/2006/math" xmlns:mc="http://schemas.openxmlformats.org/markup-compatibility/2006" xmlns:mo="http://schemas.microsoft.com/office/mac/office/2008/main" xmlns:mv="urn:schemas-microsoft-com:mac:vml" xmlns:o="urn:schemas-microsoft-com:office:office" xmlns:r="http://schemas.openxmlformats.org/officeDocument/2006/relationships" xmlns:v="urn:schemas-microsoft-com:vml" xmlns:w10="urn:schemas-microsoft-com:office:word" xmlns:w14="http://schemas.microsoft.com/office/word/2010/wordml" xmlns:w="http://schemas.openxmlformats.org/wordprocessingml/2006/main" xmlns:wne="http://schemas.microsoft.com/office/word/2006/wordml" xmlns:wp14="http://schemas.microsoft.com/office/word/2010/wordprocessingDrawing" xmlns:wp="http://schemas.openxmlformats.org/drawingml/2006/wordprocessingDrawing" xmlns:wpc="http://schemas.microsoft.com/office/word/2010/wordprocessingCanvas" xmlns:wpg="http://schemas.microsoft.com/office/word/2010/wordprocessingGroup" xmlns:wpi="http://schemas.microsoft.com/office/word/2010/wordprocessingInk" xmlns:wps="http://schemas.microsoft.com/office/word/2010/wordprocessingShape" mc:Ignorable="w14 wp14">
   <w:p>
     <w:pPr>
@@ -5468,7 +3360,7 @@
         <w:sz w:val="24"/>
       </w:rPr>
       <w:fldChar w:fldCharType="begin"/>
-      <w:instrText xml:space="preserve"> PAGE \* roman </w:instrText>
+      <w:instrText xml:space="preserve"> PAGE </w:instrText>
       <w:fldChar w:fldCharType="separate"/>
       <w:fldChar w:fldCharType="end"/>
     </w:r>
@@ -5489,7 +3381,7 @@
         <w:sz w:val="24"/>
       </w:rPr>
       <w:fldChar w:fldCharType="begin"/>
-      <w:instrText xml:space="preserve"> PAGE \* roman </w:instrText>
+      <w:instrText xml:space="preserve"> PAGE </w:instrText>
       <w:fldChar w:fldCharType="separate"/>
       <w:fldChar w:fldCharType="end"/>
     </w:r>
@@ -5510,91 +3402,7 @@
         <w:sz w:val="24"/>
       </w:rPr>
       <w:fldChar w:fldCharType="begin"/>
-      <w:instrText xml:space="preserve"> PAGE \* roman </w:instrText>
-      <w:fldChar w:fldCharType="separate"/>
-      <w:fldChar w:fldCharType="end"/>
-    </w:r>
-  </w:p>
-</w:ftr>
-</file>
-
-<file path=word/footer6.xml><?xml version="1.0" encoding="utf-8"?>
-<w:ftr xmlns:m="http://schemas.openxmlformats.org/officeDocument/2006/math" xmlns:mc="http://schemas.openxmlformats.org/markup-compatibility/2006" xmlns:mo="http://schemas.microsoft.com/office/mac/office/2008/main" xmlns:mv="urn:schemas-microsoft-com:mac:vml" xmlns:o="urn:schemas-microsoft-com:office:office" xmlns:r="http://schemas.openxmlformats.org/officeDocument/2006/relationships" xmlns:v="urn:schemas-microsoft-com:vml" xmlns:w10="urn:schemas-microsoft-com:office:word" xmlns:w14="http://schemas.microsoft.com/office/word/2010/wordml" xmlns:w="http://schemas.openxmlformats.org/wordprocessingml/2006/main" xmlns:wne="http://schemas.microsoft.com/office/word/2006/wordml" xmlns:wp14="http://schemas.microsoft.com/office/word/2010/wordprocessingDrawing" xmlns:wp="http://schemas.openxmlformats.org/drawingml/2006/wordprocessingDrawing" xmlns:wpc="http://schemas.microsoft.com/office/word/2010/wordprocessingCanvas" xmlns:wpg="http://schemas.microsoft.com/office/word/2010/wordprocessingGroup" xmlns:wpi="http://schemas.microsoft.com/office/word/2010/wordprocessingInk" xmlns:wps="http://schemas.microsoft.com/office/word/2010/wordprocessingShape" mc:Ignorable="w14 wp14">
-  <w:p>
-    <w:pPr>
-      <w:pStyle w:val="Footer"/>
-      <w:jc w:val="center"/>
-    </w:pPr>
-    <w:r>
-      <w:rPr>
-        <w:rFonts w:ascii="Times New Roman" w:hAnsi="Times New Roman"/>
-        <w:sz w:val="24"/>
-      </w:rPr>
-      <w:fldChar w:fldCharType="begin"/>
-      <w:instrText xml:space="preserve"> PAGE \* roman </w:instrText>
-      <w:fldChar w:fldCharType="separate"/>
-      <w:fldChar w:fldCharType="end"/>
-    </w:r>
-  </w:p>
-</w:ftr>
-</file>
-
-<file path=word/footer7.xml><?xml version="1.0" encoding="utf-8"?>
-<w:ftr xmlns:m="http://schemas.openxmlformats.org/officeDocument/2006/math" xmlns:mc="http://schemas.openxmlformats.org/markup-compatibility/2006" xmlns:mo="http://schemas.microsoft.com/office/mac/office/2008/main" xmlns:mv="urn:schemas-microsoft-com:mac:vml" xmlns:o="urn:schemas-microsoft-com:office:office" xmlns:r="http://schemas.openxmlformats.org/officeDocument/2006/relationships" xmlns:v="urn:schemas-microsoft-com:vml" xmlns:w10="urn:schemas-microsoft-com:office:word" xmlns:w14="http://schemas.microsoft.com/office/word/2010/wordml" xmlns:w="http://schemas.openxmlformats.org/wordprocessingml/2006/main" xmlns:wne="http://schemas.microsoft.com/office/word/2006/wordml" xmlns:wp14="http://schemas.microsoft.com/office/word/2010/wordprocessingDrawing" xmlns:wp="http://schemas.openxmlformats.org/drawingml/2006/wordprocessingDrawing" xmlns:wpc="http://schemas.microsoft.com/office/word/2010/wordprocessingCanvas" xmlns:wpg="http://schemas.microsoft.com/office/word/2010/wordprocessingGroup" xmlns:wpi="http://schemas.microsoft.com/office/word/2010/wordprocessingInk" xmlns:wps="http://schemas.microsoft.com/office/word/2010/wordprocessingShape" mc:Ignorable="w14 wp14">
-  <w:p>
-    <w:pPr>
-      <w:pStyle w:val="Footer"/>
-      <w:jc w:val="center"/>
-    </w:pPr>
-    <w:r>
-      <w:rPr>
-        <w:rFonts w:ascii="Times New Roman" w:hAnsi="Times New Roman"/>
-        <w:sz w:val="24"/>
-      </w:rPr>
-      <w:fldChar w:fldCharType="begin"/>
-      <w:instrText xml:space="preserve"> PAGE \* roman </w:instrText>
-      <w:fldChar w:fldCharType="separate"/>
-      <w:fldChar w:fldCharType="end"/>
-    </w:r>
-  </w:p>
-</w:ftr>
-</file>
-
-<file path=word/footer8.xml><?xml version="1.0" encoding="utf-8"?>
-<w:ftr xmlns:m="http://schemas.openxmlformats.org/officeDocument/2006/math" xmlns:mc="http://schemas.openxmlformats.org/markup-compatibility/2006" xmlns:mo="http://schemas.microsoft.com/office/mac/office/2008/main" xmlns:mv="urn:schemas-microsoft-com:mac:vml" xmlns:o="urn:schemas-microsoft-com:office:office" xmlns:r="http://schemas.openxmlformats.org/officeDocument/2006/relationships" xmlns:v="urn:schemas-microsoft-com:vml" xmlns:w10="urn:schemas-microsoft-com:office:word" xmlns:w14="http://schemas.microsoft.com/office/word/2010/wordml" xmlns:w="http://schemas.openxmlformats.org/wordprocessingml/2006/main" xmlns:wne="http://schemas.microsoft.com/office/word/2006/wordml" xmlns:wp14="http://schemas.microsoft.com/office/word/2010/wordprocessingDrawing" xmlns:wp="http://schemas.openxmlformats.org/drawingml/2006/wordprocessingDrawing" xmlns:wpc="http://schemas.microsoft.com/office/word/2010/wordprocessingCanvas" xmlns:wpg="http://schemas.microsoft.com/office/word/2010/wordprocessingGroup" xmlns:wpi="http://schemas.microsoft.com/office/word/2010/wordprocessingInk" xmlns:wps="http://schemas.microsoft.com/office/word/2010/wordprocessingShape" mc:Ignorable="w14 wp14">
-  <w:p>
-    <w:pPr>
-      <w:pStyle w:val="Footer"/>
-      <w:jc w:val="center"/>
-    </w:pPr>
-    <w:r>
-      <w:rPr>
-        <w:rFonts w:ascii="Times New Roman" w:hAnsi="Times New Roman"/>
-        <w:sz w:val="24"/>
-      </w:rPr>
-      <w:fldChar w:fldCharType="begin"/>
-      <w:instrText xml:space="preserve"> PAGE \* roman </w:instrText>
-      <w:fldChar w:fldCharType="separate"/>
-      <w:fldChar w:fldCharType="end"/>
-    </w:r>
-  </w:p>
-</w:ftr>
-</file>
-
-<file path=word/footer9.xml><?xml version="1.0" encoding="utf-8"?>
-<w:ftr xmlns:m="http://schemas.openxmlformats.org/officeDocument/2006/math" xmlns:mc="http://schemas.openxmlformats.org/markup-compatibility/2006" xmlns:mo="http://schemas.microsoft.com/office/mac/office/2008/main" xmlns:mv="urn:schemas-microsoft-com:mac:vml" xmlns:o="urn:schemas-microsoft-com:office:office" xmlns:r="http://schemas.openxmlformats.org/officeDocument/2006/relationships" xmlns:v="urn:schemas-microsoft-com:vml" xmlns:w10="urn:schemas-microsoft-com:office:word" xmlns:w14="http://schemas.microsoft.com/office/word/2010/wordml" xmlns:w="http://schemas.openxmlformats.org/wordprocessingml/2006/main" xmlns:wne="http://schemas.microsoft.com/office/word/2006/wordml" xmlns:wp14="http://schemas.microsoft.com/office/word/2010/wordprocessingDrawing" xmlns:wp="http://schemas.openxmlformats.org/drawingml/2006/wordprocessingDrawing" xmlns:wpc="http://schemas.microsoft.com/office/word/2010/wordprocessingCanvas" xmlns:wpg="http://schemas.microsoft.com/office/word/2010/wordprocessingGroup" xmlns:wpi="http://schemas.microsoft.com/office/word/2010/wordprocessingInk" xmlns:wps="http://schemas.microsoft.com/office/word/2010/wordprocessingShape" mc:Ignorable="w14 wp14">
-  <w:p>
-    <w:pPr>
-      <w:pStyle w:val="Footer"/>
-      <w:jc w:val="center"/>
-    </w:pPr>
-    <w:r>
-      <w:rPr>
-        <w:rFonts w:ascii="Times New Roman" w:hAnsi="Times New Roman"/>
-        <w:sz w:val="24"/>
-      </w:rPr>
-      <w:fldChar w:fldCharType="begin"/>
-      <w:instrText xml:space="preserve"> PAGE \* roman </w:instrText>
+      <w:instrText xml:space="preserve"> PAGE </w:instrText>
       <w:fldChar w:fldCharType="separate"/>
       <w:fldChar w:fldCharType="end"/>
     </w:r>

</xml_diff>

<commit_message>
Regenerar borrador de Juliano con 9 semanas
</commit_message>
<xml_diff>
--- a/juliano/reportes/Informe_Pasantia_IUTECP_BORRADOR.docx
+++ b/juliano/reportes/Informe_Pasantia_IUTECP_BORRADOR.docx
@@ -1593,7 +1593,7 @@
           <w:i w:val="0"/>
           <w:sz w:val="24"/>
         </w:rPr>
-        <w:t>El cronograma estructura temporalmente las fases de diseño y desarrollo del sistema automatizado, distribuidas a lo largo de las ocho (8) semanas de duración de la pasantía:</w:t>
+        <w:t>El cronograma estructura temporalmente las fases de diseño y desarrollo del sistema automatizado, distribuidas a lo largo de las nueve (9) semanas de duración de la pasantía:</w:t>
       </w:r>
     </w:p>
     <w:p>
@@ -1628,7 +1628,8 @@
         <w:tblLayout w:type="fixed"/>
       </w:tblPr>
       <w:tblGrid>
-        <w:gridCol w:w="4873"/>
+        <w:gridCol w:w="4448"/>
+        <w:gridCol w:w="424"/>
         <w:gridCol w:w="424"/>
         <w:gridCol w:w="424"/>
         <w:gridCol w:w="424"/>
@@ -1641,7 +1642,7 @@
       <w:tr>
         <w:tc>
           <w:tcPr>
-            <w:tcW w:w="4873" w:type="dxa"/>
+            <w:tcW w:w="4448" w:type="dxa"/>
             <w:shd w:val="clear" w:color="auto" w:fill="4472C4"/>
           </w:tcPr>
           <w:p>
@@ -1828,11 +1829,32 @@
             </w:r>
           </w:p>
         </w:tc>
+        <w:tc>
+          <w:tcPr>
+            <w:tcW w:w="424" w:type="dxa"/>
+            <w:shd w:val="clear" w:color="auto" w:fill="4472C4"/>
+          </w:tcPr>
+          <w:p>
+            <w:pPr>
+              <w:spacing w:before="60" w:after="60" w:line="240" w:lineRule="auto"/>
+              <w:jc w:val="center"/>
+            </w:pPr>
+            <w:r>
+              <w:rPr>
+                <w:rFonts w:ascii="Times New Roman" w:hAnsi="Times New Roman"/>
+                <w:b/>
+                <w:color w:val="FFFFFF"/>
+                <w:sz w:val="18"/>
+              </w:rPr>
+              <w:t>S9</w:t>
+            </w:r>
+          </w:p>
+        </w:tc>
       </w:tr>
       <w:tr>
         <w:tc>
           <w:tcPr>
-            <w:tcW w:w="4873" w:type="dxa"/>
+            <w:tcW w:w="4448" w:type="dxa"/>
             <w:shd w:val="clear" w:color="auto" w:fill="FFFFFF"/>
           </w:tcPr>
           <w:p>
@@ -1847,7 +1869,7 @@
                 <w:color w:val="000000"/>
                 <w:sz w:val="20"/>
               </w:rPr>
-              <w:t>Diagnóstico del flujo documental y debilidades del Excel.</w:t>
+              <w:t>Diagnóstico del flujo documental y levantamiento de requerimientos.</w:t>
             </w:r>
           </w:p>
         </w:tc>
@@ -2012,11 +2034,31 @@
             </w:r>
           </w:p>
         </w:tc>
+        <w:tc>
+          <w:tcPr>
+            <w:tcW w:w="424" w:type="dxa"/>
+            <w:shd w:val="clear" w:color="auto" w:fill="FFFFFF"/>
+          </w:tcPr>
+          <w:p>
+            <w:pPr>
+              <w:spacing w:before="60" w:after="60" w:line="240" w:lineRule="auto"/>
+              <w:jc w:val="center"/>
+            </w:pPr>
+            <w:r>
+              <w:rPr>
+                <w:rFonts w:ascii="Times New Roman" w:hAnsi="Times New Roman"/>
+                <w:b w:val="0"/>
+                <w:color w:val="000000"/>
+                <w:sz w:val="18"/>
+              </w:rPr>
+            </w:r>
+          </w:p>
+        </w:tc>
       </w:tr>
       <w:tr>
         <w:tc>
           <w:tcPr>
-            <w:tcW w:w="4873" w:type="dxa"/>
+            <w:tcW w:w="4448" w:type="dxa"/>
             <w:shd w:val="clear" w:color="auto" w:fill="D9E1F2"/>
           </w:tcPr>
           <w:p>
@@ -2031,7 +2073,7 @@
                 <w:color w:val="000000"/>
                 <w:sz w:val="20"/>
               </w:rPr>
-              <w:t>Diseño del modelo relacional y diccionario de datos.</w:t>
+              <w:t>Diseño del modelo relacional, normalización y diccionario de datos.</w:t>
             </w:r>
           </w:p>
         </w:tc>
@@ -2196,11 +2238,31 @@
             </w:r>
           </w:p>
         </w:tc>
+        <w:tc>
+          <w:tcPr>
+            <w:tcW w:w="424" w:type="dxa"/>
+            <w:shd w:val="clear" w:color="auto" w:fill="D9E1F2"/>
+          </w:tcPr>
+          <w:p>
+            <w:pPr>
+              <w:spacing w:before="60" w:after="60" w:line="240" w:lineRule="auto"/>
+              <w:jc w:val="center"/>
+            </w:pPr>
+            <w:r>
+              <w:rPr>
+                <w:rFonts w:ascii="Times New Roman" w:hAnsi="Times New Roman"/>
+                <w:b w:val="0"/>
+                <w:color w:val="000000"/>
+                <w:sz w:val="18"/>
+              </w:rPr>
+            </w:r>
+          </w:p>
+        </w:tc>
       </w:tr>
       <w:tr>
         <w:tc>
           <w:tcPr>
-            <w:tcW w:w="4873" w:type="dxa"/>
+            <w:tcW w:w="4448" w:type="dxa"/>
             <w:shd w:val="clear" w:color="auto" w:fill="FFFFFF"/>
           </w:tcPr>
           <w:p>
@@ -2215,7 +2277,7 @@
                 <w:color w:val="000000"/>
                 <w:sz w:val="20"/>
               </w:rPr>
-              <w:t>Despliegue de la DB en SQLite y maquetado lógico.</w:t>
+              <w:t>Implementación de la base de datos relacional en SQLite.</w:t>
             </w:r>
           </w:p>
         </w:tc>
@@ -2380,11 +2442,31 @@
             </w:r>
           </w:p>
         </w:tc>
+        <w:tc>
+          <w:tcPr>
+            <w:tcW w:w="424" w:type="dxa"/>
+            <w:shd w:val="clear" w:color="auto" w:fill="FFFFFF"/>
+          </w:tcPr>
+          <w:p>
+            <w:pPr>
+              <w:spacing w:before="60" w:after="60" w:line="240" w:lineRule="auto"/>
+              <w:jc w:val="center"/>
+            </w:pPr>
+            <w:r>
+              <w:rPr>
+                <w:rFonts w:ascii="Times New Roman" w:hAnsi="Times New Roman"/>
+                <w:b w:val="0"/>
+                <w:color w:val="000000"/>
+                <w:sz w:val="18"/>
+              </w:rPr>
+            </w:r>
+          </w:p>
+        </w:tc>
       </w:tr>
       <w:tr>
         <w:tc>
           <w:tcPr>
-            <w:tcW w:w="4873" w:type="dxa"/>
+            <w:tcW w:w="4448" w:type="dxa"/>
             <w:shd w:val="clear" w:color="auto" w:fill="D9E1F2"/>
           </w:tcPr>
           <w:p>
@@ -2399,7 +2481,7 @@
                 <w:color w:val="000000"/>
                 <w:sz w:val="20"/>
               </w:rPr>
-              <w:t>Programación de interfaces gráficas mediante código HTML.</w:t>
+              <w:t>Desarrollo de la interfaz gráfica y empaquetado con Wails.</w:t>
             </w:r>
           </w:p>
         </w:tc>
@@ -2460,6 +2542,27 @@
                 <w:color w:val="000000"/>
                 <w:sz w:val="18"/>
               </w:rPr>
+            </w:r>
+          </w:p>
+        </w:tc>
+        <w:tc>
+          <w:tcPr>
+            <w:tcW w:w="424" w:type="dxa"/>
+            <w:shd w:val="clear" w:color="auto" w:fill="70AD47"/>
+          </w:tcPr>
+          <w:p>
+            <w:pPr>
+              <w:spacing w:before="60" w:after="60" w:line="240" w:lineRule="auto"/>
+              <w:jc w:val="center"/>
+            </w:pPr>
+            <w:r>
+              <w:rPr>
+                <w:rFonts w:ascii="Times New Roman" w:hAnsi="Times New Roman"/>
+                <w:b w:val="0"/>
+                <w:color w:val="FFFFFF"/>
+                <w:sz w:val="18"/>
+              </w:rPr>
+              <w:t>✓</w:t>
             </w:r>
           </w:p>
         </w:tc>
@@ -2568,7 +2671,7 @@
       <w:tr>
         <w:tc>
           <w:tcPr>
-            <w:tcW w:w="4873" w:type="dxa"/>
+            <w:tcW w:w="4448" w:type="dxa"/>
             <w:shd w:val="clear" w:color="auto" w:fill="FFFFFF"/>
           </w:tcPr>
           <w:p>
@@ -2583,375 +2686,7 @@
                 <w:color w:val="000000"/>
                 <w:sz w:val="20"/>
               </w:rPr>
-              <w:t>Empaquetado de la aplicación de escritorio usando Wails.</w:t>
-            </w:r>
-          </w:p>
-        </w:tc>
-        <w:tc>
-          <w:tcPr>
-            <w:tcW w:w="424" w:type="dxa"/>
-            <w:shd w:val="clear" w:color="auto" w:fill="FFFFFF"/>
-          </w:tcPr>
-          <w:p>
-            <w:pPr>
-              <w:spacing w:before="60" w:after="60" w:line="240" w:lineRule="auto"/>
-              <w:jc w:val="center"/>
-            </w:pPr>
-            <w:r>
-              <w:rPr>
-                <w:rFonts w:ascii="Times New Roman" w:hAnsi="Times New Roman"/>
-                <w:b w:val="0"/>
-                <w:color w:val="000000"/>
-                <w:sz w:val="18"/>
-              </w:rPr>
-            </w:r>
-          </w:p>
-        </w:tc>
-        <w:tc>
-          <w:tcPr>
-            <w:tcW w:w="424" w:type="dxa"/>
-            <w:shd w:val="clear" w:color="auto" w:fill="FFFFFF"/>
-          </w:tcPr>
-          <w:p>
-            <w:pPr>
-              <w:spacing w:before="60" w:after="60" w:line="240" w:lineRule="auto"/>
-              <w:jc w:val="center"/>
-            </w:pPr>
-            <w:r>
-              <w:rPr>
-                <w:rFonts w:ascii="Times New Roman" w:hAnsi="Times New Roman"/>
-                <w:b w:val="0"/>
-                <w:color w:val="000000"/>
-                <w:sz w:val="18"/>
-              </w:rPr>
-            </w:r>
-          </w:p>
-        </w:tc>
-        <w:tc>
-          <w:tcPr>
-            <w:tcW w:w="424" w:type="dxa"/>
-            <w:shd w:val="clear" w:color="auto" w:fill="FFFFFF"/>
-          </w:tcPr>
-          <w:p>
-            <w:pPr>
-              <w:spacing w:before="60" w:after="60" w:line="240" w:lineRule="auto"/>
-              <w:jc w:val="center"/>
-            </w:pPr>
-            <w:r>
-              <w:rPr>
-                <w:rFonts w:ascii="Times New Roman" w:hAnsi="Times New Roman"/>
-                <w:b w:val="0"/>
-                <w:color w:val="000000"/>
-                <w:sz w:val="18"/>
-              </w:rPr>
-            </w:r>
-          </w:p>
-        </w:tc>
-        <w:tc>
-          <w:tcPr>
-            <w:tcW w:w="424" w:type="dxa"/>
-            <w:shd w:val="clear" w:color="auto" w:fill="FFFFFF"/>
-          </w:tcPr>
-          <w:p>
-            <w:pPr>
-              <w:spacing w:before="60" w:after="60" w:line="240" w:lineRule="auto"/>
-              <w:jc w:val="center"/>
-            </w:pPr>
-            <w:r>
-              <w:rPr>
-                <w:rFonts w:ascii="Times New Roman" w:hAnsi="Times New Roman"/>
-                <w:b w:val="0"/>
-                <w:color w:val="000000"/>
-                <w:sz w:val="18"/>
-              </w:rPr>
-            </w:r>
-          </w:p>
-        </w:tc>
-        <w:tc>
-          <w:tcPr>
-            <w:tcW w:w="424" w:type="dxa"/>
-            <w:shd w:val="clear" w:color="auto" w:fill="70AD47"/>
-          </w:tcPr>
-          <w:p>
-            <w:pPr>
-              <w:spacing w:before="60" w:after="60" w:line="240" w:lineRule="auto"/>
-              <w:jc w:val="center"/>
-            </w:pPr>
-            <w:r>
-              <w:rPr>
-                <w:rFonts w:ascii="Times New Roman" w:hAnsi="Times New Roman"/>
-                <w:b w:val="0"/>
-                <w:color w:val="FFFFFF"/>
-                <w:sz w:val="18"/>
-              </w:rPr>
-              <w:t>✓</w:t>
-            </w:r>
-          </w:p>
-        </w:tc>
-        <w:tc>
-          <w:tcPr>
-            <w:tcW w:w="424" w:type="dxa"/>
-            <w:shd w:val="clear" w:color="auto" w:fill="FFFFFF"/>
-          </w:tcPr>
-          <w:p>
-            <w:pPr>
-              <w:spacing w:before="60" w:after="60" w:line="240" w:lineRule="auto"/>
-              <w:jc w:val="center"/>
-            </w:pPr>
-            <w:r>
-              <w:rPr>
-                <w:rFonts w:ascii="Times New Roman" w:hAnsi="Times New Roman"/>
-                <w:b w:val="0"/>
-                <w:color w:val="000000"/>
-                <w:sz w:val="18"/>
-              </w:rPr>
-            </w:r>
-          </w:p>
-        </w:tc>
-        <w:tc>
-          <w:tcPr>
-            <w:tcW w:w="424" w:type="dxa"/>
-            <w:shd w:val="clear" w:color="auto" w:fill="FFFFFF"/>
-          </w:tcPr>
-          <w:p>
-            <w:pPr>
-              <w:spacing w:before="60" w:after="60" w:line="240" w:lineRule="auto"/>
-              <w:jc w:val="center"/>
-            </w:pPr>
-            <w:r>
-              <w:rPr>
-                <w:rFonts w:ascii="Times New Roman" w:hAnsi="Times New Roman"/>
-                <w:b w:val="0"/>
-                <w:color w:val="000000"/>
-                <w:sz w:val="18"/>
-              </w:rPr>
-            </w:r>
-          </w:p>
-        </w:tc>
-        <w:tc>
-          <w:tcPr>
-            <w:tcW w:w="424" w:type="dxa"/>
-            <w:shd w:val="clear" w:color="auto" w:fill="FFFFFF"/>
-          </w:tcPr>
-          <w:p>
-            <w:pPr>
-              <w:spacing w:before="60" w:after="60" w:line="240" w:lineRule="auto"/>
-              <w:jc w:val="center"/>
-            </w:pPr>
-            <w:r>
-              <w:rPr>
-                <w:rFonts w:ascii="Times New Roman" w:hAnsi="Times New Roman"/>
-                <w:b w:val="0"/>
-                <w:color w:val="000000"/>
-                <w:sz w:val="18"/>
-              </w:rPr>
-            </w:r>
-          </w:p>
-        </w:tc>
-      </w:tr>
-      <w:tr>
-        <w:tc>
-          <w:tcPr>
-            <w:tcW w:w="4873" w:type="dxa"/>
-            <w:shd w:val="clear" w:color="auto" w:fill="D9E1F2"/>
-          </w:tcPr>
-          <w:p>
-            <w:pPr>
-              <w:spacing w:before="60" w:after="60" w:line="240" w:lineRule="auto"/>
-              <w:jc w:val="both"/>
-            </w:pPr>
-            <w:r>
-              <w:rPr>
-                <w:rFonts w:ascii="Times New Roman" w:hAnsi="Times New Roman"/>
-                <w:b w:val="0"/>
-                <w:color w:val="000000"/>
-                <w:sz w:val="20"/>
-              </w:rPr>
-              <w:t>Integración con la base de datos y desarrollo de consultas.</w:t>
-            </w:r>
-          </w:p>
-        </w:tc>
-        <w:tc>
-          <w:tcPr>
-            <w:tcW w:w="424" w:type="dxa"/>
-            <w:shd w:val="clear" w:color="auto" w:fill="D9E1F2"/>
-          </w:tcPr>
-          <w:p>
-            <w:pPr>
-              <w:spacing w:before="60" w:after="60" w:line="240" w:lineRule="auto"/>
-              <w:jc w:val="center"/>
-            </w:pPr>
-            <w:r>
-              <w:rPr>
-                <w:rFonts w:ascii="Times New Roman" w:hAnsi="Times New Roman"/>
-                <w:b w:val="0"/>
-                <w:color w:val="000000"/>
-                <w:sz w:val="18"/>
-              </w:rPr>
-            </w:r>
-          </w:p>
-        </w:tc>
-        <w:tc>
-          <w:tcPr>
-            <w:tcW w:w="424" w:type="dxa"/>
-            <w:shd w:val="clear" w:color="auto" w:fill="D9E1F2"/>
-          </w:tcPr>
-          <w:p>
-            <w:pPr>
-              <w:spacing w:before="60" w:after="60" w:line="240" w:lineRule="auto"/>
-              <w:jc w:val="center"/>
-            </w:pPr>
-            <w:r>
-              <w:rPr>
-                <w:rFonts w:ascii="Times New Roman" w:hAnsi="Times New Roman"/>
-                <w:b w:val="0"/>
-                <w:color w:val="000000"/>
-                <w:sz w:val="18"/>
-              </w:rPr>
-            </w:r>
-          </w:p>
-        </w:tc>
-        <w:tc>
-          <w:tcPr>
-            <w:tcW w:w="424" w:type="dxa"/>
-            <w:shd w:val="clear" w:color="auto" w:fill="D9E1F2"/>
-          </w:tcPr>
-          <w:p>
-            <w:pPr>
-              <w:spacing w:before="60" w:after="60" w:line="240" w:lineRule="auto"/>
-              <w:jc w:val="center"/>
-            </w:pPr>
-            <w:r>
-              <w:rPr>
-                <w:rFonts w:ascii="Times New Roman" w:hAnsi="Times New Roman"/>
-                <w:b w:val="0"/>
-                <w:color w:val="000000"/>
-                <w:sz w:val="18"/>
-              </w:rPr>
-            </w:r>
-          </w:p>
-        </w:tc>
-        <w:tc>
-          <w:tcPr>
-            <w:tcW w:w="424" w:type="dxa"/>
-            <w:shd w:val="clear" w:color="auto" w:fill="D9E1F2"/>
-          </w:tcPr>
-          <w:p>
-            <w:pPr>
-              <w:spacing w:before="60" w:after="60" w:line="240" w:lineRule="auto"/>
-              <w:jc w:val="center"/>
-            </w:pPr>
-            <w:r>
-              <w:rPr>
-                <w:rFonts w:ascii="Times New Roman" w:hAnsi="Times New Roman"/>
-                <w:b w:val="0"/>
-                <w:color w:val="000000"/>
-                <w:sz w:val="18"/>
-              </w:rPr>
-            </w:r>
-          </w:p>
-        </w:tc>
-        <w:tc>
-          <w:tcPr>
-            <w:tcW w:w="424" w:type="dxa"/>
-            <w:shd w:val="clear" w:color="auto" w:fill="D9E1F2"/>
-          </w:tcPr>
-          <w:p>
-            <w:pPr>
-              <w:spacing w:before="60" w:after="60" w:line="240" w:lineRule="auto"/>
-              <w:jc w:val="center"/>
-            </w:pPr>
-            <w:r>
-              <w:rPr>
-                <w:rFonts w:ascii="Times New Roman" w:hAnsi="Times New Roman"/>
-                <w:b w:val="0"/>
-                <w:color w:val="000000"/>
-                <w:sz w:val="18"/>
-              </w:rPr>
-            </w:r>
-          </w:p>
-        </w:tc>
-        <w:tc>
-          <w:tcPr>
-            <w:tcW w:w="424" w:type="dxa"/>
-            <w:shd w:val="clear" w:color="auto" w:fill="70AD47"/>
-          </w:tcPr>
-          <w:p>
-            <w:pPr>
-              <w:spacing w:before="60" w:after="60" w:line="240" w:lineRule="auto"/>
-              <w:jc w:val="center"/>
-            </w:pPr>
-            <w:r>
-              <w:rPr>
-                <w:rFonts w:ascii="Times New Roman" w:hAnsi="Times New Roman"/>
-                <w:b w:val="0"/>
-                <w:color w:val="FFFFFF"/>
-                <w:sz w:val="18"/>
-              </w:rPr>
-              <w:t>✓</w:t>
-            </w:r>
-          </w:p>
-        </w:tc>
-        <w:tc>
-          <w:tcPr>
-            <w:tcW w:w="424" w:type="dxa"/>
-            <w:shd w:val="clear" w:color="auto" w:fill="D9E1F2"/>
-          </w:tcPr>
-          <w:p>
-            <w:pPr>
-              <w:spacing w:before="60" w:after="60" w:line="240" w:lineRule="auto"/>
-              <w:jc w:val="center"/>
-            </w:pPr>
-            <w:r>
-              <w:rPr>
-                <w:rFonts w:ascii="Times New Roman" w:hAnsi="Times New Roman"/>
-                <w:b w:val="0"/>
-                <w:color w:val="000000"/>
-                <w:sz w:val="18"/>
-              </w:rPr>
-            </w:r>
-          </w:p>
-        </w:tc>
-        <w:tc>
-          <w:tcPr>
-            <w:tcW w:w="424" w:type="dxa"/>
-            <w:shd w:val="clear" w:color="auto" w:fill="D9E1F2"/>
-          </w:tcPr>
-          <w:p>
-            <w:pPr>
-              <w:spacing w:before="60" w:after="60" w:line="240" w:lineRule="auto"/>
-              <w:jc w:val="center"/>
-            </w:pPr>
-            <w:r>
-              <w:rPr>
-                <w:rFonts w:ascii="Times New Roman" w:hAnsi="Times New Roman"/>
-                <w:b w:val="0"/>
-                <w:color w:val="000000"/>
-                <w:sz w:val="18"/>
-              </w:rPr>
-            </w:r>
-          </w:p>
-        </w:tc>
-      </w:tr>
-      <w:tr>
-        <w:tc>
-          <w:tcPr>
-            <w:tcW w:w="4873" w:type="dxa"/>
-            <w:shd w:val="clear" w:color="auto" w:fill="FFFFFF"/>
-          </w:tcPr>
-          <w:p>
-            <w:pPr>
-              <w:spacing w:before="60" w:after="60" w:line="240" w:lineRule="auto"/>
-              <w:jc w:val="both"/>
-            </w:pPr>
-            <w:r>
-              <w:rPr>
-                <w:rFonts w:ascii="Times New Roman" w:hAnsi="Times New Roman"/>
-                <w:b w:val="0"/>
-                <w:color w:val="000000"/>
-                <w:sz w:val="20"/>
-              </w:rPr>
-              <w:t>Pruebas funcionales de trazabilidad y generación de reportes.</w:t>
+              <w:t>Integración, pruebas funcionales y consolidación del sistema.</w:t>
             </w:r>
           </w:p>
         </w:tc>
@@ -3099,7 +2834,93 @@
         <w:tc>
           <w:tcPr>
             <w:tcW w:w="424" w:type="dxa"/>
-            <w:shd w:val="clear" w:color="auto" w:fill="FFFFFF"/>
+            <w:shd w:val="clear" w:color="auto" w:fill="70AD47"/>
+          </w:tcPr>
+          <w:p>
+            <w:pPr>
+              <w:spacing w:before="60" w:after="60" w:line="240" w:lineRule="auto"/>
+              <w:jc w:val="center"/>
+            </w:pPr>
+            <w:r>
+              <w:rPr>
+                <w:rFonts w:ascii="Times New Roman" w:hAnsi="Times New Roman"/>
+                <w:b w:val="0"/>
+                <w:color w:val="FFFFFF"/>
+                <w:sz w:val="18"/>
+              </w:rPr>
+              <w:t>✓</w:t>
+            </w:r>
+          </w:p>
+        </w:tc>
+        <w:tc>
+          <w:tcPr>
+            <w:tcW w:w="424" w:type="dxa"/>
+            <w:shd w:val="clear" w:color="auto" w:fill="70AD47"/>
+          </w:tcPr>
+          <w:p>
+            <w:pPr>
+              <w:spacing w:before="60" w:after="60" w:line="240" w:lineRule="auto"/>
+              <w:jc w:val="center"/>
+            </w:pPr>
+            <w:r>
+              <w:rPr>
+                <w:rFonts w:ascii="Times New Roman" w:hAnsi="Times New Roman"/>
+                <w:b w:val="0"/>
+                <w:color w:val="FFFFFF"/>
+                <w:sz w:val="18"/>
+              </w:rPr>
+              <w:t>✓</w:t>
+            </w:r>
+          </w:p>
+        </w:tc>
+      </w:tr>
+      <w:tr>
+        <w:tc>
+          <w:tcPr>
+            <w:tcW w:w="4448" w:type="dxa"/>
+            <w:shd w:val="clear" w:color="auto" w:fill="D9E1F2"/>
+          </w:tcPr>
+          <w:p>
+            <w:pPr>
+              <w:spacing w:before="60" w:after="60" w:line="240" w:lineRule="auto"/>
+              <w:jc w:val="both"/>
+            </w:pPr>
+            <w:r>
+              <w:rPr>
+                <w:rFonts w:ascii="Times New Roman" w:hAnsi="Times New Roman"/>
+                <w:b w:val="0"/>
+                <w:color w:val="000000"/>
+                <w:sz w:val="20"/>
+              </w:rPr>
+              <w:t>Inducción institucional y capacitación en seguridad (SIAHO).</w:t>
+            </w:r>
+          </w:p>
+        </w:tc>
+        <w:tc>
+          <w:tcPr>
+            <w:tcW w:w="424" w:type="dxa"/>
+            <w:shd w:val="clear" w:color="auto" w:fill="70AD47"/>
+          </w:tcPr>
+          <w:p>
+            <w:pPr>
+              <w:spacing w:before="60" w:after="60" w:line="240" w:lineRule="auto"/>
+              <w:jc w:val="center"/>
+            </w:pPr>
+            <w:r>
+              <w:rPr>
+                <w:rFonts w:ascii="Times New Roman" w:hAnsi="Times New Roman"/>
+                <w:b w:val="0"/>
+                <w:color w:val="FFFFFF"/>
+                <w:sz w:val="18"/>
+              </w:rPr>
+              <w:t>✓</w:t>
+            </w:r>
+          </w:p>
+        </w:tc>
+        <w:tc>
+          <w:tcPr>
+            <w:tcW w:w="424" w:type="dxa"/>
+            <w:shd w:val="clear" w:color="auto" w:fill="D9E1F2"/>
           </w:tcPr>
           <w:p>
             <w:pPr>
@@ -3116,26 +2937,44 @@
             </w:r>
           </w:p>
         </w:tc>
-      </w:tr>
-      <w:tr>
         <w:tc>
           <w:tcPr>
-            <w:tcW w:w="4873" w:type="dxa"/>
+            <w:tcW w:w="424" w:type="dxa"/>
             <w:shd w:val="clear" w:color="auto" w:fill="D9E1F2"/>
           </w:tcPr>
           <w:p>
             <w:pPr>
               <w:spacing w:before="60" w:after="60" w:line="240" w:lineRule="auto"/>
-              <w:jc w:val="both"/>
+              <w:jc w:val="center"/>
             </w:pPr>
             <w:r>
               <w:rPr>
                 <w:rFonts w:ascii="Times New Roman" w:hAnsi="Times New Roman"/>
                 <w:b w:val="0"/>
                 <w:color w:val="000000"/>
-                <w:sz w:val="20"/>
+                <w:sz w:val="18"/>
               </w:rPr>
-              <w:t>Consolidación técnica y redacción del informe final.</w:t>
+            </w:r>
+          </w:p>
+        </w:tc>
+        <w:tc>
+          <w:tcPr>
+            <w:tcW w:w="424" w:type="dxa"/>
+            <w:shd w:val="clear" w:color="auto" w:fill="70AD47"/>
+          </w:tcPr>
+          <w:p>
+            <w:pPr>
+              <w:spacing w:before="60" w:after="60" w:line="240" w:lineRule="auto"/>
+              <w:jc w:val="center"/>
+            </w:pPr>
+            <w:r>
+              <w:rPr>
+                <w:rFonts w:ascii="Times New Roman" w:hAnsi="Times New Roman"/>
+                <w:b w:val="0"/>
+                <w:color w:val="FFFFFF"/>
+                <w:sz w:val="18"/>
+              </w:rPr>
+              <w:t>✓</w:t>
             </w:r>
           </w:p>
         </w:tc>
@@ -3239,6 +3078,234 @@
             </w:r>
           </w:p>
         </w:tc>
+      </w:tr>
+      <w:tr>
+        <w:tc>
+          <w:tcPr>
+            <w:tcW w:w="4448" w:type="dxa"/>
+            <w:shd w:val="clear" w:color="auto" w:fill="FFFFFF"/>
+          </w:tcPr>
+          <w:p>
+            <w:pPr>
+              <w:spacing w:before="60" w:after="60" w:line="240" w:lineRule="auto"/>
+              <w:jc w:val="both"/>
+            </w:pPr>
+            <w:r>
+              <w:rPr>
+                <w:rFonts w:ascii="Times New Roman" w:hAnsi="Times New Roman"/>
+                <w:b w:val="0"/>
+                <w:color w:val="000000"/>
+                <w:sz w:val="20"/>
+              </w:rPr>
+              <w:t>Registro y actualización de expedientes en hoja de cálculo.</w:t>
+            </w:r>
+          </w:p>
+        </w:tc>
+        <w:tc>
+          <w:tcPr>
+            <w:tcW w:w="424" w:type="dxa"/>
+            <w:shd w:val="clear" w:color="auto" w:fill="FFFFFF"/>
+          </w:tcPr>
+          <w:p>
+            <w:pPr>
+              <w:spacing w:before="60" w:after="60" w:line="240" w:lineRule="auto"/>
+              <w:jc w:val="center"/>
+            </w:pPr>
+            <w:r>
+              <w:rPr>
+                <w:rFonts w:ascii="Times New Roman" w:hAnsi="Times New Roman"/>
+                <w:b w:val="0"/>
+                <w:color w:val="000000"/>
+                <w:sz w:val="18"/>
+              </w:rPr>
+            </w:r>
+          </w:p>
+        </w:tc>
+        <w:tc>
+          <w:tcPr>
+            <w:tcW w:w="424" w:type="dxa"/>
+            <w:shd w:val="clear" w:color="auto" w:fill="70AD47"/>
+          </w:tcPr>
+          <w:p>
+            <w:pPr>
+              <w:spacing w:before="60" w:after="60" w:line="240" w:lineRule="auto"/>
+              <w:jc w:val="center"/>
+            </w:pPr>
+            <w:r>
+              <w:rPr>
+                <w:rFonts w:ascii="Times New Roman" w:hAnsi="Times New Roman"/>
+                <w:b w:val="0"/>
+                <w:color w:val="FFFFFF"/>
+                <w:sz w:val="18"/>
+              </w:rPr>
+              <w:t>✓</w:t>
+            </w:r>
+          </w:p>
+        </w:tc>
+        <w:tc>
+          <w:tcPr>
+            <w:tcW w:w="424" w:type="dxa"/>
+            <w:shd w:val="clear" w:color="auto" w:fill="70AD47"/>
+          </w:tcPr>
+          <w:p>
+            <w:pPr>
+              <w:spacing w:before="60" w:after="60" w:line="240" w:lineRule="auto"/>
+              <w:jc w:val="center"/>
+            </w:pPr>
+            <w:r>
+              <w:rPr>
+                <w:rFonts w:ascii="Times New Roman" w:hAnsi="Times New Roman"/>
+                <w:b w:val="0"/>
+                <w:color w:val="FFFFFF"/>
+                <w:sz w:val="18"/>
+              </w:rPr>
+              <w:t>✓</w:t>
+            </w:r>
+          </w:p>
+        </w:tc>
+        <w:tc>
+          <w:tcPr>
+            <w:tcW w:w="424" w:type="dxa"/>
+            <w:shd w:val="clear" w:color="auto" w:fill="FFFFFF"/>
+          </w:tcPr>
+          <w:p>
+            <w:pPr>
+              <w:spacing w:before="60" w:after="60" w:line="240" w:lineRule="auto"/>
+              <w:jc w:val="center"/>
+            </w:pPr>
+            <w:r>
+              <w:rPr>
+                <w:rFonts w:ascii="Times New Roman" w:hAnsi="Times New Roman"/>
+                <w:b w:val="0"/>
+                <w:color w:val="000000"/>
+                <w:sz w:val="18"/>
+              </w:rPr>
+            </w:r>
+          </w:p>
+        </w:tc>
+        <w:tc>
+          <w:tcPr>
+            <w:tcW w:w="424" w:type="dxa"/>
+            <w:shd w:val="clear" w:color="auto" w:fill="FFFFFF"/>
+          </w:tcPr>
+          <w:p>
+            <w:pPr>
+              <w:spacing w:before="60" w:after="60" w:line="240" w:lineRule="auto"/>
+              <w:jc w:val="center"/>
+            </w:pPr>
+            <w:r>
+              <w:rPr>
+                <w:rFonts w:ascii="Times New Roman" w:hAnsi="Times New Roman"/>
+                <w:b w:val="0"/>
+                <w:color w:val="000000"/>
+                <w:sz w:val="18"/>
+              </w:rPr>
+            </w:r>
+          </w:p>
+        </w:tc>
+        <w:tc>
+          <w:tcPr>
+            <w:tcW w:w="424" w:type="dxa"/>
+            <w:shd w:val="clear" w:color="auto" w:fill="FFFFFF"/>
+          </w:tcPr>
+          <w:p>
+            <w:pPr>
+              <w:spacing w:before="60" w:after="60" w:line="240" w:lineRule="auto"/>
+              <w:jc w:val="center"/>
+            </w:pPr>
+            <w:r>
+              <w:rPr>
+                <w:rFonts w:ascii="Times New Roman" w:hAnsi="Times New Roman"/>
+                <w:b w:val="0"/>
+                <w:color w:val="000000"/>
+                <w:sz w:val="18"/>
+              </w:rPr>
+            </w:r>
+          </w:p>
+        </w:tc>
+        <w:tc>
+          <w:tcPr>
+            <w:tcW w:w="424" w:type="dxa"/>
+            <w:shd w:val="clear" w:color="auto" w:fill="FFFFFF"/>
+          </w:tcPr>
+          <w:p>
+            <w:pPr>
+              <w:spacing w:before="60" w:after="60" w:line="240" w:lineRule="auto"/>
+              <w:jc w:val="center"/>
+            </w:pPr>
+            <w:r>
+              <w:rPr>
+                <w:rFonts w:ascii="Times New Roman" w:hAnsi="Times New Roman"/>
+                <w:b w:val="0"/>
+                <w:color w:val="000000"/>
+                <w:sz w:val="18"/>
+              </w:rPr>
+            </w:r>
+          </w:p>
+        </w:tc>
+        <w:tc>
+          <w:tcPr>
+            <w:tcW w:w="424" w:type="dxa"/>
+            <w:shd w:val="clear" w:color="auto" w:fill="FFFFFF"/>
+          </w:tcPr>
+          <w:p>
+            <w:pPr>
+              <w:spacing w:before="60" w:after="60" w:line="240" w:lineRule="auto"/>
+              <w:jc w:val="center"/>
+            </w:pPr>
+            <w:r>
+              <w:rPr>
+                <w:rFonts w:ascii="Times New Roman" w:hAnsi="Times New Roman"/>
+                <w:b w:val="0"/>
+                <w:color w:val="000000"/>
+                <w:sz w:val="18"/>
+              </w:rPr>
+            </w:r>
+          </w:p>
+        </w:tc>
+        <w:tc>
+          <w:tcPr>
+            <w:tcW w:w="424" w:type="dxa"/>
+            <w:shd w:val="clear" w:color="auto" w:fill="FFFFFF"/>
+          </w:tcPr>
+          <w:p>
+            <w:pPr>
+              <w:spacing w:before="60" w:after="60" w:line="240" w:lineRule="auto"/>
+              <w:jc w:val="center"/>
+            </w:pPr>
+            <w:r>
+              <w:rPr>
+                <w:rFonts w:ascii="Times New Roman" w:hAnsi="Times New Roman"/>
+                <w:b w:val="0"/>
+                <w:color w:val="000000"/>
+                <w:sz w:val="18"/>
+              </w:rPr>
+            </w:r>
+          </w:p>
+        </w:tc>
+      </w:tr>
+      <w:tr>
+        <w:tc>
+          <w:tcPr>
+            <w:tcW w:w="4448" w:type="dxa"/>
+            <w:shd w:val="clear" w:color="auto" w:fill="D9E1F2"/>
+          </w:tcPr>
+          <w:p>
+            <w:pPr>
+              <w:spacing w:before="60" w:after="60" w:line="240" w:lineRule="auto"/>
+              <w:jc w:val="both"/>
+            </w:pPr>
+            <w:r>
+              <w:rPr>
+                <w:rFonts w:ascii="Times New Roman" w:hAnsi="Times New Roman"/>
+                <w:b w:val="0"/>
+                <w:color w:val="000000"/>
+                <w:sz w:val="20"/>
+              </w:rPr>
+              <w:t>Revisión y canalización de correspondencia presidencial.</w:t>
+            </w:r>
+          </w:p>
+        </w:tc>
         <w:tc>
           <w:tcPr>
             <w:tcW w:w="424" w:type="dxa"/>
@@ -3276,6 +3343,332 @@
                 <w:color w:val="000000"/>
                 <w:sz w:val="18"/>
               </w:rPr>
+            </w:r>
+          </w:p>
+        </w:tc>
+        <w:tc>
+          <w:tcPr>
+            <w:tcW w:w="424" w:type="dxa"/>
+            <w:shd w:val="clear" w:color="auto" w:fill="D9E1F2"/>
+          </w:tcPr>
+          <w:p>
+            <w:pPr>
+              <w:spacing w:before="60" w:after="60" w:line="240" w:lineRule="auto"/>
+              <w:jc w:val="center"/>
+            </w:pPr>
+            <w:r>
+              <w:rPr>
+                <w:rFonts w:ascii="Times New Roman" w:hAnsi="Times New Roman"/>
+                <w:b w:val="0"/>
+                <w:color w:val="000000"/>
+                <w:sz w:val="18"/>
+              </w:rPr>
+            </w:r>
+          </w:p>
+        </w:tc>
+        <w:tc>
+          <w:tcPr>
+            <w:tcW w:w="424" w:type="dxa"/>
+            <w:shd w:val="clear" w:color="auto" w:fill="D9E1F2"/>
+          </w:tcPr>
+          <w:p>
+            <w:pPr>
+              <w:spacing w:before="60" w:after="60" w:line="240" w:lineRule="auto"/>
+              <w:jc w:val="center"/>
+            </w:pPr>
+            <w:r>
+              <w:rPr>
+                <w:rFonts w:ascii="Times New Roman" w:hAnsi="Times New Roman"/>
+                <w:b w:val="0"/>
+                <w:color w:val="000000"/>
+                <w:sz w:val="18"/>
+              </w:rPr>
+            </w:r>
+          </w:p>
+        </w:tc>
+        <w:tc>
+          <w:tcPr>
+            <w:tcW w:w="424" w:type="dxa"/>
+            <w:shd w:val="clear" w:color="auto" w:fill="70AD47"/>
+          </w:tcPr>
+          <w:p>
+            <w:pPr>
+              <w:spacing w:before="60" w:after="60" w:line="240" w:lineRule="auto"/>
+              <w:jc w:val="center"/>
+            </w:pPr>
+            <w:r>
+              <w:rPr>
+                <w:rFonts w:ascii="Times New Roman" w:hAnsi="Times New Roman"/>
+                <w:b w:val="0"/>
+                <w:color w:val="FFFFFF"/>
+                <w:sz w:val="18"/>
+              </w:rPr>
+              <w:t>✓</w:t>
+            </w:r>
+          </w:p>
+        </w:tc>
+        <w:tc>
+          <w:tcPr>
+            <w:tcW w:w="424" w:type="dxa"/>
+            <w:shd w:val="clear" w:color="auto" w:fill="70AD47"/>
+          </w:tcPr>
+          <w:p>
+            <w:pPr>
+              <w:spacing w:before="60" w:after="60" w:line="240" w:lineRule="auto"/>
+              <w:jc w:val="center"/>
+            </w:pPr>
+            <w:r>
+              <w:rPr>
+                <w:rFonts w:ascii="Times New Roman" w:hAnsi="Times New Roman"/>
+                <w:b w:val="0"/>
+                <w:color w:val="FFFFFF"/>
+                <w:sz w:val="18"/>
+              </w:rPr>
+              <w:t>✓</w:t>
+            </w:r>
+          </w:p>
+        </w:tc>
+        <w:tc>
+          <w:tcPr>
+            <w:tcW w:w="424" w:type="dxa"/>
+            <w:shd w:val="clear" w:color="auto" w:fill="D9E1F2"/>
+          </w:tcPr>
+          <w:p>
+            <w:pPr>
+              <w:spacing w:before="60" w:after="60" w:line="240" w:lineRule="auto"/>
+              <w:jc w:val="center"/>
+            </w:pPr>
+            <w:r>
+              <w:rPr>
+                <w:rFonts w:ascii="Times New Roman" w:hAnsi="Times New Roman"/>
+                <w:b w:val="0"/>
+                <w:color w:val="000000"/>
+                <w:sz w:val="18"/>
+              </w:rPr>
+            </w:r>
+          </w:p>
+        </w:tc>
+        <w:tc>
+          <w:tcPr>
+            <w:tcW w:w="424" w:type="dxa"/>
+            <w:shd w:val="clear" w:color="auto" w:fill="D9E1F2"/>
+          </w:tcPr>
+          <w:p>
+            <w:pPr>
+              <w:spacing w:before="60" w:after="60" w:line="240" w:lineRule="auto"/>
+              <w:jc w:val="center"/>
+            </w:pPr>
+            <w:r>
+              <w:rPr>
+                <w:rFonts w:ascii="Times New Roman" w:hAnsi="Times New Roman"/>
+                <w:b w:val="0"/>
+                <w:color w:val="000000"/>
+                <w:sz w:val="18"/>
+              </w:rPr>
+            </w:r>
+          </w:p>
+        </w:tc>
+        <w:tc>
+          <w:tcPr>
+            <w:tcW w:w="424" w:type="dxa"/>
+            <w:shd w:val="clear" w:color="auto" w:fill="D9E1F2"/>
+          </w:tcPr>
+          <w:p>
+            <w:pPr>
+              <w:spacing w:before="60" w:after="60" w:line="240" w:lineRule="auto"/>
+              <w:jc w:val="center"/>
+            </w:pPr>
+            <w:r>
+              <w:rPr>
+                <w:rFonts w:ascii="Times New Roman" w:hAnsi="Times New Roman"/>
+                <w:b w:val="0"/>
+                <w:color w:val="000000"/>
+                <w:sz w:val="18"/>
+              </w:rPr>
+            </w:r>
+          </w:p>
+        </w:tc>
+      </w:tr>
+      <w:tr>
+        <w:tc>
+          <w:tcPr>
+            <w:tcW w:w="4448" w:type="dxa"/>
+            <w:shd w:val="clear" w:color="auto" w:fill="FFFFFF"/>
+          </w:tcPr>
+          <w:p>
+            <w:pPr>
+              <w:spacing w:before="60" w:after="60" w:line="240" w:lineRule="auto"/>
+              <w:jc w:val="both"/>
+            </w:pPr>
+            <w:r>
+              <w:rPr>
+                <w:rFonts w:ascii="Times New Roman" w:hAnsi="Times New Roman"/>
+                <w:b w:val="0"/>
+                <w:color w:val="000000"/>
+                <w:sz w:val="20"/>
+              </w:rPr>
+              <w:t>Apoyo en generación de reportes y cierre administrativo.</w:t>
+            </w:r>
+          </w:p>
+        </w:tc>
+        <w:tc>
+          <w:tcPr>
+            <w:tcW w:w="424" w:type="dxa"/>
+            <w:shd w:val="clear" w:color="auto" w:fill="FFFFFF"/>
+          </w:tcPr>
+          <w:p>
+            <w:pPr>
+              <w:spacing w:before="60" w:after="60" w:line="240" w:lineRule="auto"/>
+              <w:jc w:val="center"/>
+            </w:pPr>
+            <w:r>
+              <w:rPr>
+                <w:rFonts w:ascii="Times New Roman" w:hAnsi="Times New Roman"/>
+                <w:b w:val="0"/>
+                <w:color w:val="000000"/>
+                <w:sz w:val="18"/>
+              </w:rPr>
+            </w:r>
+          </w:p>
+        </w:tc>
+        <w:tc>
+          <w:tcPr>
+            <w:tcW w:w="424" w:type="dxa"/>
+            <w:shd w:val="clear" w:color="auto" w:fill="FFFFFF"/>
+          </w:tcPr>
+          <w:p>
+            <w:pPr>
+              <w:spacing w:before="60" w:after="60" w:line="240" w:lineRule="auto"/>
+              <w:jc w:val="center"/>
+            </w:pPr>
+            <w:r>
+              <w:rPr>
+                <w:rFonts w:ascii="Times New Roman" w:hAnsi="Times New Roman"/>
+                <w:b w:val="0"/>
+                <w:color w:val="000000"/>
+                <w:sz w:val="18"/>
+              </w:rPr>
+            </w:r>
+          </w:p>
+        </w:tc>
+        <w:tc>
+          <w:tcPr>
+            <w:tcW w:w="424" w:type="dxa"/>
+            <w:shd w:val="clear" w:color="auto" w:fill="FFFFFF"/>
+          </w:tcPr>
+          <w:p>
+            <w:pPr>
+              <w:spacing w:before="60" w:after="60" w:line="240" w:lineRule="auto"/>
+              <w:jc w:val="center"/>
+            </w:pPr>
+            <w:r>
+              <w:rPr>
+                <w:rFonts w:ascii="Times New Roman" w:hAnsi="Times New Roman"/>
+                <w:b w:val="0"/>
+                <w:color w:val="000000"/>
+                <w:sz w:val="18"/>
+              </w:rPr>
+            </w:r>
+          </w:p>
+        </w:tc>
+        <w:tc>
+          <w:tcPr>
+            <w:tcW w:w="424" w:type="dxa"/>
+            <w:shd w:val="clear" w:color="auto" w:fill="FFFFFF"/>
+          </w:tcPr>
+          <w:p>
+            <w:pPr>
+              <w:spacing w:before="60" w:after="60" w:line="240" w:lineRule="auto"/>
+              <w:jc w:val="center"/>
+            </w:pPr>
+            <w:r>
+              <w:rPr>
+                <w:rFonts w:ascii="Times New Roman" w:hAnsi="Times New Roman"/>
+                <w:b w:val="0"/>
+                <w:color w:val="000000"/>
+                <w:sz w:val="18"/>
+              </w:rPr>
+            </w:r>
+          </w:p>
+        </w:tc>
+        <w:tc>
+          <w:tcPr>
+            <w:tcW w:w="424" w:type="dxa"/>
+            <w:shd w:val="clear" w:color="auto" w:fill="FFFFFF"/>
+          </w:tcPr>
+          <w:p>
+            <w:pPr>
+              <w:spacing w:before="60" w:after="60" w:line="240" w:lineRule="auto"/>
+              <w:jc w:val="center"/>
+            </w:pPr>
+            <w:r>
+              <w:rPr>
+                <w:rFonts w:ascii="Times New Roman" w:hAnsi="Times New Roman"/>
+                <w:b w:val="0"/>
+                <w:color w:val="000000"/>
+                <w:sz w:val="18"/>
+              </w:rPr>
+            </w:r>
+          </w:p>
+        </w:tc>
+        <w:tc>
+          <w:tcPr>
+            <w:tcW w:w="424" w:type="dxa"/>
+            <w:shd w:val="clear" w:color="auto" w:fill="FFFFFF"/>
+          </w:tcPr>
+          <w:p>
+            <w:pPr>
+              <w:spacing w:before="60" w:after="60" w:line="240" w:lineRule="auto"/>
+              <w:jc w:val="center"/>
+            </w:pPr>
+            <w:r>
+              <w:rPr>
+                <w:rFonts w:ascii="Times New Roman" w:hAnsi="Times New Roman"/>
+                <w:b w:val="0"/>
+                <w:color w:val="000000"/>
+                <w:sz w:val="18"/>
+              </w:rPr>
+            </w:r>
+          </w:p>
+        </w:tc>
+        <w:tc>
+          <w:tcPr>
+            <w:tcW w:w="424" w:type="dxa"/>
+            <w:shd w:val="clear" w:color="auto" w:fill="FFFFFF"/>
+          </w:tcPr>
+          <w:p>
+            <w:pPr>
+              <w:spacing w:before="60" w:after="60" w:line="240" w:lineRule="auto"/>
+              <w:jc w:val="center"/>
+            </w:pPr>
+            <w:r>
+              <w:rPr>
+                <w:rFonts w:ascii="Times New Roman" w:hAnsi="Times New Roman"/>
+                <w:b w:val="0"/>
+                <w:color w:val="000000"/>
+                <w:sz w:val="18"/>
+              </w:rPr>
+            </w:r>
+          </w:p>
+        </w:tc>
+        <w:tc>
+          <w:tcPr>
+            <w:tcW w:w="424" w:type="dxa"/>
+            <w:shd w:val="clear" w:color="auto" w:fill="70AD47"/>
+          </w:tcPr>
+          <w:p>
+            <w:pPr>
+              <w:spacing w:before="60" w:after="60" w:line="240" w:lineRule="auto"/>
+              <w:jc w:val="center"/>
+            </w:pPr>
+            <w:r>
+              <w:rPr>
+                <w:rFonts w:ascii="Times New Roman" w:hAnsi="Times New Roman"/>
+                <w:b w:val="0"/>
+                <w:color w:val="FFFFFF"/>
+                <w:sz w:val="18"/>
+              </w:rPr>
+              <w:t>✓</w:t>
             </w:r>
           </w:p>
         </w:tc>

</xml_diff>